<commit_message>
Added Repository Link in the report
</commit_message>
<xml_diff>
--- a/Report/x24320170_EEAI_CA1_Report.docx
+++ b/Report/x24320170_EEAI_CA1_Report.docx
@@ -179,7 +179,7 @@
           </w:tcPr>
           <w:p>
             <w:pPr>
-              <w:pStyle w:val="10"/>
+              <w:pStyle w:val="12"/>
               <w:ind w:left="50"/>
               <w:rPr>
                 <w:rFonts w:ascii="Verdana"/>
@@ -222,7 +222,7 @@
           </w:tcPr>
           <w:p>
             <w:pPr>
-              <w:pStyle w:val="10"/>
+              <w:pStyle w:val="12"/>
               <w:ind w:left="263"/>
               <w:rPr>
                 <w:rFonts w:ascii="Verdana"/>
@@ -284,7 +284,7 @@
           </w:tcPr>
           <w:p>
             <w:pPr>
-              <w:pStyle w:val="10"/>
+              <w:pStyle w:val="12"/>
               <w:rPr>
                 <w:rFonts w:ascii="Times New Roman"/>
                 <w:sz w:val="18"/>
@@ -303,7 +303,7 @@
           </w:tcPr>
           <w:p>
             <w:pPr>
-              <w:pStyle w:val="10"/>
+              <w:pStyle w:val="12"/>
               <w:spacing w:before="109"/>
               <w:ind w:left="50"/>
               <w:rPr>
@@ -347,7 +347,7 @@
           </w:tcPr>
           <w:p>
             <w:pPr>
-              <w:pStyle w:val="10"/>
+              <w:pStyle w:val="12"/>
               <w:spacing w:before="109"/>
               <w:ind w:left="263"/>
               <w:rPr>
@@ -373,7 +373,7 @@
           </w:tcPr>
           <w:p>
             <w:pPr>
-              <w:pStyle w:val="10"/>
+              <w:pStyle w:val="12"/>
               <w:rPr>
                 <w:rFonts w:ascii="Times New Roman"/>
                 <w:sz w:val="18"/>
@@ -387,7 +387,7 @@
           </w:tcPr>
           <w:p>
             <w:pPr>
-              <w:pStyle w:val="10"/>
+              <w:pStyle w:val="12"/>
               <w:rPr>
                 <w:rFonts w:ascii="Times New Roman"/>
                 <w:sz w:val="18"/>
@@ -406,7 +406,7 @@
           </w:tcPr>
           <w:p>
             <w:pPr>
-              <w:pStyle w:val="10"/>
+              <w:pStyle w:val="12"/>
               <w:spacing w:before="110" w:line="199" w:lineRule="exact"/>
               <w:ind w:left="50"/>
               <w:rPr>
@@ -432,7 +432,7 @@
           </w:tcPr>
           <w:p>
             <w:pPr>
-              <w:pStyle w:val="10"/>
+              <w:pStyle w:val="12"/>
               <w:spacing w:before="110" w:line="199" w:lineRule="exact"/>
               <w:ind w:left="263"/>
               <w:rPr>
@@ -501,7 +501,7 @@
           </w:tcPr>
           <w:p>
             <w:pPr>
-              <w:pStyle w:val="10"/>
+              <w:pStyle w:val="12"/>
               <w:spacing w:before="110" w:line="199" w:lineRule="exact"/>
               <w:ind w:left="640"/>
               <w:rPr>
@@ -527,7 +527,7 @@
           </w:tcPr>
           <w:p>
             <w:pPr>
-              <w:pStyle w:val="10"/>
+              <w:pStyle w:val="12"/>
               <w:spacing w:before="110" w:line="199" w:lineRule="exact"/>
               <w:ind w:left="301"/>
               <w:rPr>
@@ -753,7 +753,9 @@
         <w:ind w:left="2054" w:right="2502" w:hanging="1901"/>
         <w:jc w:val="left"/>
         <w:rPr>
-          <w:sz w:val="18"/>
+          <w:spacing w:val="-2"/>
+          <w:sz w:val="18"/>
+          <w:lang w:val="en-US" w:eastAsia="zh-CN"/>
         </w:rPr>
       </w:pPr>
       <w:r>
@@ -794,6 +796,75 @@
           <w:lang w:val="en-US" w:eastAsia="zh-CN"/>
         </w:rPr>
         <w:t>Modular Email Classification Architecture: Chained Multi-Output Classification and Hierarchical Modelling</w:t>
+      </w:r>
+    </w:p>
+    <w:p>
+      <w:pPr>
+        <w:tabs>
+          <w:tab w:val="left" w:pos="2054"/>
+        </w:tabs>
+        <w:spacing w:before="218" w:line="240" w:lineRule="auto"/>
+        <w:ind w:left="1761" w:leftChars="69" w:right="2502" w:hanging="1609" w:hangingChars="914"/>
+        <w:jc w:val="left"/>
+        <w:rPr>
+          <w:rFonts w:hint="default" w:ascii="Trebuchet MS Bold" w:hAnsi="Trebuchet MS Bold" w:cs="Trebuchet MS Bold"/>
+          <w:b/>
+          <w:bCs/>
+          <w:spacing w:val="-2"/>
+          <w:sz w:val="18"/>
+          <w:lang w:val="en-US" w:eastAsia="zh-CN"/>
+        </w:rPr>
+      </w:pPr>
+      <w:r>
+        <w:rPr>
+          <w:rFonts w:hint="default" w:ascii="Trebuchet MS Bold" w:hAnsi="Trebuchet MS Bold" w:cs="Trebuchet MS Bold"/>
+          <w:b/>
+          <w:bCs/>
+          <w:spacing w:val="-2"/>
+          <w:sz w:val="18"/>
+          <w:lang w:val="en-US" w:eastAsia="zh-CN"/>
+        </w:rPr>
+        <w:t xml:space="preserve">GitHub Repository: </w:t>
+      </w:r>
+      <w:r>
+        <w:rPr>
+          <w:rFonts w:hint="default" w:ascii="Trebuchet MS Bold" w:hAnsi="Trebuchet MS Bold" w:cs="Trebuchet MS Bold"/>
+          <w:b/>
+          <w:bCs/>
+          <w:spacing w:val="-2"/>
+          <w:sz w:val="18"/>
+          <w:lang w:val="en-US" w:eastAsia="zh-CN"/>
+        </w:rPr>
+        <w:tab/>
+      </w:r>
+      <w:r>
+        <w:rPr>
+          <w:rFonts w:hint="default"/>
+          <w:spacing w:val="-2"/>
+          <w:sz w:val="18"/>
+          <w:lang w:val="en-US" w:eastAsia="zh-CN"/>
+        </w:rPr>
+        <w:t>EEA_MultiLabel_Email_Classifier -</w:t>
+      </w:r>
+      <w:r>
+        <w:rPr>
+          <w:rFonts w:hint="default"/>
+          <w:spacing w:val="-2"/>
+          <w:sz w:val="18"/>
+          <w:lang w:val="en-US" w:eastAsia="zh-CN"/>
+        </w:rPr>
+        <w:tab/>
+      </w:r>
+      <w:r>
+        <w:rPr>
+          <w:rFonts w:hint="default" w:ascii="Trebuchet MS Bold" w:hAnsi="Trebuchet MS Bold" w:cs="Trebuchet MS Bold"/>
+          <w:b/>
+          <w:bCs/>
+          <w:spacing w:val="-2"/>
+          <w:sz w:val="18"/>
+          <w:lang w:val="en-US" w:eastAsia="zh-CN"/>
+        </w:rPr>
+        <w:t xml:space="preserve">https://github.com/hasnat360/EEA_MultiLabel_Email_Classifier </w:t>
       </w:r>
     </w:p>
     <w:p>
@@ -3793,7 +3864,7 @@
     </w:p>
     <w:p>
       <w:pPr>
-        <w:pStyle w:val="9"/>
+        <w:pStyle w:val="11"/>
         <w:numPr>
           <w:ilvl w:val="0"/>
           <w:numId w:val="1"/>
@@ -3974,7 +4045,7 @@
     </w:p>
     <w:p>
       <w:pPr>
-        <w:pStyle w:val="9"/>
+        <w:pStyle w:val="11"/>
         <w:numPr>
           <w:ilvl w:val="0"/>
           <w:numId w:val="1"/>
@@ -4090,7 +4161,7 @@
     </w:p>
     <w:p>
       <w:pPr>
-        <w:pStyle w:val="9"/>
+        <w:pStyle w:val="11"/>
         <w:numPr>
           <w:ilvl w:val="0"/>
           <w:numId w:val="1"/>
@@ -4402,7 +4473,7 @@
     </w:p>
     <w:p>
       <w:pPr>
-        <w:pStyle w:val="9"/>
+        <w:pStyle w:val="11"/>
         <w:numPr>
           <w:ilvl w:val="0"/>
           <w:numId w:val="1"/>
@@ -4528,7 +4599,7 @@
     </w:p>
     <w:p>
       <w:pPr>
-        <w:pStyle w:val="9"/>
+        <w:pStyle w:val="11"/>
         <w:numPr>
           <w:ilvl w:val="0"/>
           <w:numId w:val="1"/>
@@ -4761,7 +4832,7 @@
     </w:p>
     <w:p>
       <w:pPr>
-        <w:pStyle w:val="9"/>
+        <w:pStyle w:val="11"/>
         <w:numPr>
           <w:ilvl w:val="0"/>
           <w:numId w:val="1"/>
@@ -5023,7 +5094,7 @@
           </w:tcPr>
           <w:p>
             <w:pPr>
-              <w:pStyle w:val="10"/>
+              <w:pStyle w:val="12"/>
               <w:spacing w:line="199" w:lineRule="exact"/>
               <w:ind w:left="107"/>
               <w:rPr>
@@ -5089,7 +5160,7 @@
           </w:tcPr>
           <w:p>
             <w:pPr>
-              <w:pStyle w:val="10"/>
+              <w:pStyle w:val="12"/>
               <w:spacing w:line="199" w:lineRule="exact"/>
               <w:ind w:left="107"/>
               <w:rPr>
@@ -5113,7 +5184,7 @@
           </w:tcPr>
           <w:p>
             <w:pPr>
-              <w:pStyle w:val="10"/>
+              <w:pStyle w:val="12"/>
               <w:rPr>
                 <w:rFonts w:ascii="Times New Roman"/>
                 <w:sz w:val="14"/>
@@ -5132,7 +5203,7 @@
           </w:tcPr>
           <w:p>
             <w:pPr>
-              <w:pStyle w:val="10"/>
+              <w:pStyle w:val="12"/>
               <w:spacing w:line="199" w:lineRule="exact"/>
               <w:ind w:left="107"/>
               <w:rPr>
@@ -5156,7 +5227,7 @@
           </w:tcPr>
           <w:p>
             <w:pPr>
-              <w:pStyle w:val="10"/>
+              <w:pStyle w:val="12"/>
               <w:rPr>
                 <w:rFonts w:ascii="Times New Roman"/>
                 <w:sz w:val="14"/>
@@ -5175,7 +5246,7 @@
           </w:tcPr>
           <w:p>
             <w:pPr>
-              <w:pStyle w:val="10"/>
+              <w:pStyle w:val="12"/>
               <w:spacing w:line="198" w:lineRule="exact"/>
               <w:ind w:left="107"/>
               <w:rPr>
@@ -5244,7 +5315,7 @@
           </w:tcPr>
           <w:p>
             <w:pPr>
-              <w:pStyle w:val="10"/>
+              <w:pStyle w:val="12"/>
               <w:rPr>
                 <w:rFonts w:ascii="Times New Roman"/>
                 <w:sz w:val="14"/>
@@ -5412,7 +5483,7 @@
           </w:tcPr>
           <w:p>
             <w:pPr>
-              <w:pStyle w:val="10"/>
+              <w:pStyle w:val="12"/>
               <w:spacing w:before="14"/>
               <w:ind w:left="15"/>
               <w:rPr>
@@ -5481,7 +5552,7 @@
           </w:tcPr>
           <w:p>
             <w:pPr>
-              <w:pStyle w:val="10"/>
+              <w:pStyle w:val="12"/>
               <w:spacing w:before="14"/>
               <w:ind w:left="252"/>
               <w:rPr>
@@ -5509,7 +5580,7 @@
           </w:tcPr>
           <w:p>
             <w:pPr>
-              <w:pStyle w:val="10"/>
+              <w:pStyle w:val="12"/>
               <w:spacing w:before="14"/>
               <w:ind w:left="7"/>
               <w:rPr>
@@ -5546,7 +5617,7 @@
           </w:tcPr>
           <w:p>
             <w:pPr>
-              <w:pStyle w:val="10"/>
+              <w:pStyle w:val="12"/>
               <w:tabs>
                 <w:tab w:val="left" w:pos="1234"/>
               </w:tabs>
@@ -5609,7 +5680,7 @@
           </w:tcPr>
           <w:p>
             <w:pPr>
-              <w:pStyle w:val="10"/>
+              <w:pStyle w:val="12"/>
               <w:rPr>
                 <w:rFonts w:hint="default" w:ascii="Times New Roman"/>
                 <w:sz w:val="24"/>
@@ -5640,7 +5711,7 @@
           </w:tcPr>
           <w:p>
             <w:pPr>
-              <w:pStyle w:val="10"/>
+              <w:pStyle w:val="12"/>
               <w:spacing w:before="11"/>
               <w:ind w:left="72"/>
               <w:rPr>
@@ -6024,7 +6095,7 @@
           </w:tcPr>
           <w:p>
             <w:pPr>
-              <w:pStyle w:val="10"/>
+              <w:pStyle w:val="12"/>
               <w:tabs>
                 <w:tab w:val="left" w:pos="1800"/>
                 <w:tab w:val="left" w:pos="6713"/>
@@ -6202,7 +6273,7 @@
           </w:tcPr>
           <w:p>
             <w:pPr>
-              <w:pStyle w:val="10"/>
+              <w:pStyle w:val="12"/>
               <w:rPr>
                 <w:rFonts w:hint="default" w:ascii="Times New Roman"/>
                 <w:sz w:val="22"/>
@@ -6229,7 +6300,7 @@
           </w:tcPr>
           <w:p>
             <w:pPr>
-              <w:pStyle w:val="10"/>
+              <w:pStyle w:val="12"/>
               <w:rPr>
                 <w:rFonts w:ascii="Times New Roman"/>
                 <w:sz w:val="22"/>
@@ -6247,7 +6318,7 @@
           </w:tcPr>
           <w:p>
             <w:pPr>
-              <w:pStyle w:val="10"/>
+              <w:pStyle w:val="12"/>
               <w:rPr>
                 <w:rFonts w:ascii="Times New Roman"/>
                 <w:sz w:val="22"/>
@@ -6266,7 +6337,7 @@
           </w:tcPr>
           <w:p>
             <w:pPr>
-              <w:pStyle w:val="10"/>
+              <w:pStyle w:val="12"/>
               <w:spacing w:line="242" w:lineRule="auto"/>
               <w:ind w:right="-15"/>
               <w:jc w:val="both"/>
@@ -6310,7 +6381,7 @@
           </w:tcPr>
           <w:p>
             <w:pPr>
-              <w:pStyle w:val="10"/>
+              <w:pStyle w:val="12"/>
               <w:spacing w:line="264" w:lineRule="exact"/>
               <w:ind w:left="6"/>
               <w:jc w:val="both"/>
@@ -6423,7 +6494,7 @@
           </w:tcPr>
           <w:p>
             <w:pPr>
-              <w:pStyle w:val="10"/>
+              <w:pStyle w:val="12"/>
               <w:spacing w:line="275" w:lineRule="exact"/>
               <w:ind w:left="73"/>
               <w:rPr>
@@ -8443,7 +8514,7 @@
           </w:tcPr>
           <w:p>
             <w:pPr>
-              <w:pStyle w:val="10"/>
+              <w:pStyle w:val="12"/>
               <w:spacing w:line="224" w:lineRule="exact"/>
               <w:ind w:left="9"/>
               <w:jc w:val="center"/>
@@ -8487,7 +8558,7 @@
           </w:tcPr>
           <w:p>
             <w:pPr>
-              <w:pStyle w:val="10"/>
+              <w:pStyle w:val="12"/>
               <w:spacing w:line="224" w:lineRule="exact"/>
               <w:ind w:left="11"/>
               <w:jc w:val="center"/>
@@ -8531,7 +8602,7 @@
           </w:tcPr>
           <w:p>
             <w:pPr>
-              <w:pStyle w:val="10"/>
+              <w:pStyle w:val="12"/>
               <w:spacing w:line="224" w:lineRule="exact"/>
               <w:ind w:left="10"/>
               <w:jc w:val="center"/>
@@ -8559,7 +8630,7 @@
           </w:tcPr>
           <w:p>
             <w:pPr>
-              <w:pStyle w:val="10"/>
+              <w:pStyle w:val="12"/>
               <w:spacing w:line="224" w:lineRule="exact"/>
               <w:ind w:left="769"/>
               <w:rPr>
@@ -8589,7 +8660,7 @@
           </w:tcPr>
           <w:p>
             <w:pPr>
-              <w:pStyle w:val="10"/>
+              <w:pStyle w:val="12"/>
               <w:spacing w:line="252" w:lineRule="auto"/>
               <w:ind w:right="93"/>
               <w:rPr>
@@ -8639,7 +8710,7 @@
           </w:p>
           <w:p>
             <w:pPr>
-              <w:pStyle w:val="10"/>
+              <w:pStyle w:val="12"/>
               <w:spacing w:line="212" w:lineRule="exact"/>
               <w:rPr>
                 <w:sz w:val="19"/>
@@ -8660,7 +8731,7 @@
           </w:tcPr>
           <w:p>
             <w:pPr>
-              <w:pStyle w:val="10"/>
+              <w:pStyle w:val="12"/>
               <w:spacing w:line="252" w:lineRule="auto"/>
               <w:ind w:left="108"/>
               <w:rPr>
@@ -8684,7 +8755,7 @@
           </w:p>
           <w:p>
             <w:pPr>
-              <w:pStyle w:val="10"/>
+              <w:pStyle w:val="12"/>
               <w:spacing w:line="212" w:lineRule="exact"/>
               <w:ind w:left="108"/>
               <w:rPr>
@@ -8722,7 +8793,7 @@
           </w:tcPr>
           <w:p>
             <w:pPr>
-              <w:pStyle w:val="10"/>
+              <w:pStyle w:val="12"/>
               <w:spacing w:before="11"/>
               <w:ind w:left="0"/>
               <w:rPr>
@@ -8732,7 +8803,7 @@
           </w:p>
           <w:p>
             <w:pPr>
-              <w:pStyle w:val="10"/>
+              <w:pStyle w:val="12"/>
               <w:ind w:left="108"/>
               <w:rPr>
                 <w:sz w:val="19"/>
@@ -8753,7 +8824,7 @@
           </w:tcPr>
           <w:p>
             <w:pPr>
-              <w:pStyle w:val="10"/>
+              <w:pStyle w:val="12"/>
               <w:spacing w:line="252" w:lineRule="auto"/>
               <w:ind w:right="145"/>
               <w:rPr>
@@ -8790,7 +8861,7 @@
           </w:p>
           <w:p>
             <w:pPr>
-              <w:pStyle w:val="10"/>
+              <w:pStyle w:val="12"/>
               <w:spacing w:line="212" w:lineRule="exact"/>
               <w:rPr>
                 <w:sz w:val="19"/>
@@ -8844,7 +8915,7 @@
           </w:tcPr>
           <w:p>
             <w:pPr>
-              <w:pStyle w:val="10"/>
+              <w:pStyle w:val="12"/>
               <w:spacing w:before="11"/>
               <w:ind w:left="0"/>
               <w:rPr>
@@ -8854,7 +8925,7 @@
           </w:p>
           <w:p>
             <w:pPr>
-              <w:pStyle w:val="10"/>
+              <w:pStyle w:val="12"/>
               <w:rPr>
                 <w:sz w:val="19"/>
               </w:rPr>
@@ -8888,7 +8959,7 @@
           </w:tcPr>
           <w:p>
             <w:pPr>
-              <w:pStyle w:val="10"/>
+              <w:pStyle w:val="12"/>
               <w:spacing w:before="116" w:line="252" w:lineRule="auto"/>
               <w:ind w:left="108"/>
               <w:rPr>
@@ -8959,7 +9030,7 @@
           </w:tcPr>
           <w:p>
             <w:pPr>
-              <w:pStyle w:val="10"/>
+              <w:pStyle w:val="12"/>
               <w:spacing w:before="11"/>
               <w:ind w:left="0"/>
               <w:rPr>
@@ -8969,7 +9040,7 @@
           </w:p>
           <w:p>
             <w:pPr>
-              <w:pStyle w:val="10"/>
+              <w:pStyle w:val="12"/>
               <w:ind w:left="108"/>
               <w:rPr>
                 <w:sz w:val="19"/>
@@ -8990,7 +9061,7 @@
           </w:tcPr>
           <w:p>
             <w:pPr>
-              <w:pStyle w:val="10"/>
+              <w:pStyle w:val="12"/>
               <w:spacing w:line="252" w:lineRule="auto"/>
               <w:rPr>
                 <w:sz w:val="19"/>
@@ -9080,7 +9151,7 @@
           </w:p>
           <w:p>
             <w:pPr>
-              <w:pStyle w:val="10"/>
+              <w:pStyle w:val="12"/>
               <w:spacing w:before="1" w:line="211" w:lineRule="exact"/>
               <w:rPr>
                 <w:sz w:val="19"/>
@@ -9134,7 +9205,7 @@
           </w:tcPr>
           <w:p>
             <w:pPr>
-              <w:pStyle w:val="10"/>
+              <w:pStyle w:val="12"/>
               <w:spacing w:before="127"/>
               <w:ind w:left="0"/>
               <w:rPr>
@@ -9144,7 +9215,7 @@
           </w:p>
           <w:p>
             <w:pPr>
-              <w:pStyle w:val="10"/>
+              <w:pStyle w:val="12"/>
               <w:rPr>
                 <w:sz w:val="19"/>
               </w:rPr>
@@ -9164,7 +9235,7 @@
           </w:tcPr>
           <w:p>
             <w:pPr>
-              <w:pStyle w:val="10"/>
+              <w:pStyle w:val="12"/>
               <w:spacing w:before="11"/>
               <w:ind w:left="0"/>
               <w:rPr>
@@ -9174,7 +9245,7 @@
           </w:p>
           <w:p>
             <w:pPr>
-              <w:pStyle w:val="10"/>
+              <w:pStyle w:val="12"/>
               <w:spacing w:line="254" w:lineRule="auto"/>
               <w:rPr>
                 <w:sz w:val="19"/>
@@ -9214,7 +9285,7 @@
           </w:tcPr>
           <w:p>
             <w:pPr>
-              <w:pStyle w:val="10"/>
+              <w:pStyle w:val="12"/>
               <w:spacing w:before="127"/>
               <w:ind w:left="0"/>
               <w:rPr>
@@ -9224,7 +9295,7 @@
           </w:p>
           <w:p>
             <w:pPr>
-              <w:pStyle w:val="10"/>
+              <w:pStyle w:val="12"/>
               <w:ind w:left="108"/>
               <w:rPr>
                 <w:sz w:val="19"/>
@@ -9245,7 +9316,7 @@
           </w:tcPr>
           <w:p>
             <w:pPr>
-              <w:pStyle w:val="10"/>
+              <w:pStyle w:val="12"/>
               <w:spacing w:line="252" w:lineRule="auto"/>
               <w:ind w:right="145"/>
               <w:rPr>
@@ -9327,7 +9398,7 @@
           </w:p>
           <w:p>
             <w:pPr>
-              <w:pStyle w:val="10"/>
+              <w:pStyle w:val="12"/>
               <w:spacing w:before="1" w:line="211" w:lineRule="exact"/>
               <w:rPr>
                 <w:sz w:val="19"/>
@@ -9353,7 +9424,7 @@
           </w:tcPr>
           <w:p>
             <w:pPr>
-              <w:pStyle w:val="10"/>
+              <w:pStyle w:val="12"/>
               <w:spacing w:before="116" w:line="254" w:lineRule="auto"/>
               <w:rPr>
                 <w:sz w:val="19"/>
@@ -9406,7 +9477,7 @@
           </w:tcPr>
           <w:p>
             <w:pPr>
-              <w:pStyle w:val="10"/>
+              <w:pStyle w:val="12"/>
               <w:spacing w:before="116" w:line="254" w:lineRule="auto"/>
               <w:ind w:left="108"/>
               <w:rPr>
@@ -9447,7 +9518,7 @@
           </w:tcPr>
           <w:p>
             <w:pPr>
-              <w:pStyle w:val="10"/>
+              <w:pStyle w:val="12"/>
               <w:spacing w:before="12"/>
               <w:ind w:left="0"/>
               <w:rPr>
@@ -9457,7 +9528,7 @@
           </w:p>
           <w:p>
             <w:pPr>
-              <w:pStyle w:val="10"/>
+              <w:pStyle w:val="12"/>
               <w:ind w:left="108"/>
               <w:rPr>
                 <w:sz w:val="19"/>
@@ -9478,7 +9549,7 @@
           </w:tcPr>
           <w:p>
             <w:pPr>
-              <w:pStyle w:val="10"/>
+              <w:pStyle w:val="12"/>
               <w:spacing w:before="1" w:line="252" w:lineRule="auto"/>
               <w:ind w:right="145"/>
               <w:rPr>
@@ -9558,7 +9629,7 @@
           </w:p>
           <w:p>
             <w:pPr>
-              <w:pStyle w:val="10"/>
+              <w:pStyle w:val="12"/>
               <w:spacing w:line="211" w:lineRule="exact"/>
               <w:rPr>
                 <w:sz w:val="19"/>
@@ -9612,7 +9683,7 @@
           </w:tcPr>
           <w:p>
             <w:pPr>
-              <w:pStyle w:val="10"/>
+              <w:pStyle w:val="12"/>
               <w:spacing w:before="117" w:line="254" w:lineRule="auto"/>
               <w:rPr>
                 <w:sz w:val="19"/>
@@ -9665,7 +9736,7 @@
           </w:tcPr>
           <w:p>
             <w:pPr>
-              <w:pStyle w:val="10"/>
+              <w:pStyle w:val="12"/>
               <w:spacing w:before="12"/>
               <w:ind w:left="0"/>
               <w:rPr>
@@ -9675,7 +9746,7 @@
           </w:p>
           <w:p>
             <w:pPr>
-              <w:pStyle w:val="10"/>
+              <w:pStyle w:val="12"/>
               <w:ind w:left="11" w:right="3"/>
               <w:jc w:val="center"/>
               <w:rPr>
@@ -9697,7 +9768,7 @@
           </w:tcPr>
           <w:p>
             <w:pPr>
-              <w:pStyle w:val="10"/>
+              <w:pStyle w:val="12"/>
               <w:spacing w:before="12"/>
               <w:ind w:left="0"/>
               <w:rPr>
@@ -9707,7 +9778,7 @@
           </w:p>
           <w:p>
             <w:pPr>
-              <w:pStyle w:val="10"/>
+              <w:pStyle w:val="12"/>
               <w:ind w:left="108"/>
               <w:rPr>
                 <w:sz w:val="19"/>
@@ -9728,7 +9799,7 @@
           </w:tcPr>
           <w:p>
             <w:pPr>
-              <w:pStyle w:val="10"/>
+              <w:pStyle w:val="12"/>
               <w:spacing w:before="1" w:line="252" w:lineRule="auto"/>
               <w:rPr>
                 <w:sz w:val="19"/>
@@ -9804,7 +9875,7 @@
           </w:p>
           <w:p>
             <w:pPr>
-              <w:pStyle w:val="10"/>
+              <w:pStyle w:val="12"/>
               <w:spacing w:line="212" w:lineRule="exact"/>
               <w:rPr>
                 <w:sz w:val="19"/>
@@ -9844,7 +9915,7 @@
           </w:tcPr>
           <w:p>
             <w:pPr>
-              <w:pStyle w:val="10"/>
+              <w:pStyle w:val="12"/>
               <w:spacing w:before="116" w:line="252" w:lineRule="auto"/>
               <w:ind w:right="93"/>
               <w:rPr>
@@ -9912,7 +9983,7 @@
           </w:tcPr>
           <w:p>
             <w:pPr>
-              <w:pStyle w:val="10"/>
+              <w:pStyle w:val="12"/>
               <w:spacing w:before="11"/>
               <w:ind w:left="0"/>
               <w:rPr>
@@ -9922,7 +9993,7 @@
           </w:p>
           <w:p>
             <w:pPr>
-              <w:pStyle w:val="10"/>
+              <w:pStyle w:val="12"/>
               <w:ind w:left="11" w:right="9"/>
               <w:jc w:val="center"/>
               <w:rPr>
@@ -10000,7 +10071,7 @@
           </w:tcPr>
           <w:p>
             <w:pPr>
-              <w:pStyle w:val="10"/>
+              <w:pStyle w:val="12"/>
               <w:spacing w:before="11"/>
               <w:ind w:left="0"/>
               <w:rPr>
@@ -10010,7 +10081,7 @@
           </w:p>
           <w:p>
             <w:pPr>
-              <w:pStyle w:val="10"/>
+              <w:pStyle w:val="12"/>
               <w:ind w:left="108"/>
               <w:rPr>
                 <w:sz w:val="19"/>
@@ -10031,7 +10102,7 @@
           </w:tcPr>
           <w:p>
             <w:pPr>
-              <w:pStyle w:val="10"/>
+              <w:pStyle w:val="12"/>
               <w:spacing w:line="252" w:lineRule="auto"/>
               <w:ind w:right="145"/>
               <w:rPr>
@@ -10108,7 +10179,7 @@
           </w:p>
           <w:p>
             <w:pPr>
-              <w:pStyle w:val="10"/>
+              <w:pStyle w:val="12"/>
               <w:spacing w:before="1" w:line="211" w:lineRule="exact"/>
               <w:rPr>
                 <w:sz w:val="19"/>
@@ -10203,7 +10274,7 @@
           </w:tcPr>
           <w:p>
             <w:pPr>
-              <w:pStyle w:val="10"/>
+              <w:pStyle w:val="12"/>
               <w:spacing w:before="80"/>
               <w:ind w:left="678"/>
               <w:rPr>
@@ -10240,7 +10311,7 @@
           </w:tcPr>
           <w:p>
             <w:pPr>
-              <w:pStyle w:val="10"/>
+              <w:pStyle w:val="12"/>
               <w:spacing w:before="131"/>
               <w:ind w:left="139"/>
               <w:rPr>
@@ -10261,7 +10332,7 @@
           </w:p>
           <w:p>
             <w:pPr>
-              <w:pStyle w:val="10"/>
+              <w:pStyle w:val="12"/>
               <w:spacing w:before="42"/>
               <w:ind w:left="182"/>
               <w:rPr>
@@ -10293,7 +10364,7 @@
           </w:tcPr>
           <w:p>
             <w:pPr>
-              <w:pStyle w:val="10"/>
+              <w:pStyle w:val="12"/>
               <w:spacing w:before="105"/>
               <w:ind w:left="-3" w:right="-15"/>
               <w:rPr>
@@ -10327,7 +10398,7 @@
           </w:tcPr>
           <w:p>
             <w:pPr>
-              <w:pStyle w:val="10"/>
+              <w:pStyle w:val="12"/>
               <w:spacing w:before="131"/>
               <w:ind w:left="130"/>
               <w:rPr>
@@ -10349,7 +10420,7 @@
           </w:p>
           <w:p>
             <w:pPr>
-              <w:pStyle w:val="10"/>
+              <w:pStyle w:val="12"/>
               <w:spacing w:before="42"/>
               <w:ind w:left="205"/>
               <w:rPr>
@@ -10381,7 +10452,7 @@
           </w:tcPr>
           <w:p>
             <w:pPr>
-              <w:pStyle w:val="10"/>
+              <w:pStyle w:val="12"/>
               <w:spacing w:before="105"/>
               <w:ind w:left="-5"/>
               <w:rPr>
@@ -10415,7 +10486,7 @@
           </w:tcPr>
           <w:p>
             <w:pPr>
-              <w:pStyle w:val="10"/>
+              <w:pStyle w:val="12"/>
               <w:spacing w:before="131"/>
               <w:ind w:left="186"/>
               <w:rPr>
@@ -10437,7 +10508,7 @@
           </w:p>
           <w:p>
             <w:pPr>
-              <w:pStyle w:val="10"/>
+              <w:pStyle w:val="12"/>
               <w:spacing w:before="42"/>
               <w:ind w:left="150"/>
               <w:rPr>
@@ -10469,7 +10540,7 @@
           </w:tcPr>
           <w:p>
             <w:pPr>
-              <w:pStyle w:val="10"/>
+              <w:pStyle w:val="12"/>
               <w:spacing w:before="105"/>
               <w:ind w:left="-7"/>
               <w:rPr>
@@ -10503,7 +10574,7 @@
           </w:tcPr>
           <w:p>
             <w:pPr>
-              <w:pStyle w:val="10"/>
+              <w:pStyle w:val="12"/>
               <w:spacing w:before="131"/>
               <w:ind w:left="200"/>
               <w:rPr>
@@ -10534,7 +10605,7 @@
           </w:p>
           <w:p>
             <w:pPr>
-              <w:pStyle w:val="10"/>
+              <w:pStyle w:val="12"/>
               <w:spacing w:before="42"/>
               <w:ind w:left="151"/>
               <w:rPr>
@@ -10566,7 +10637,7 @@
           </w:tcPr>
           <w:p>
             <w:pPr>
-              <w:pStyle w:val="10"/>
+              <w:pStyle w:val="12"/>
               <w:spacing w:before="105"/>
               <w:ind w:left="-9"/>
               <w:rPr>
@@ -10600,7 +10671,7 @@
           </w:tcPr>
           <w:p>
             <w:pPr>
-              <w:pStyle w:val="10"/>
+              <w:pStyle w:val="12"/>
               <w:spacing w:before="131"/>
               <w:ind w:left="281"/>
               <w:rPr>
@@ -10622,7 +10693,7 @@
           </w:p>
           <w:p>
             <w:pPr>
-              <w:pStyle w:val="10"/>
+              <w:pStyle w:val="12"/>
               <w:spacing w:before="42"/>
               <w:ind w:left="240"/>
               <w:rPr>
@@ -10654,7 +10725,7 @@
           </w:tcPr>
           <w:p>
             <w:pPr>
-              <w:pStyle w:val="10"/>
+              <w:pStyle w:val="12"/>
               <w:spacing w:before="105"/>
               <w:ind w:left="-11"/>
               <w:rPr>
@@ -10688,7 +10759,7 @@
           </w:tcPr>
           <w:p>
             <w:pPr>
-              <w:pStyle w:val="10"/>
+              <w:pStyle w:val="12"/>
               <w:spacing w:before="131"/>
               <w:ind w:left="440"/>
               <w:rPr>
@@ -10708,7 +10779,7 @@
           </w:p>
           <w:p>
             <w:pPr>
-              <w:pStyle w:val="10"/>
+              <w:pStyle w:val="12"/>
               <w:spacing w:before="42"/>
               <w:ind w:left="447"/>
               <w:rPr>
@@ -10743,7 +10814,7 @@
           </w:tcPr>
           <w:p>
             <w:pPr>
-              <w:pStyle w:val="10"/>
+              <w:pStyle w:val="12"/>
               <w:spacing w:before="50"/>
               <w:ind w:left="5"/>
               <w:jc w:val="center"/>
@@ -10769,7 +10840,7 @@
           </w:tcPr>
           <w:p>
             <w:pPr>
-              <w:pStyle w:val="10"/>
+              <w:pStyle w:val="12"/>
               <w:ind w:left="0"/>
               <w:rPr>
                 <w:rFonts w:ascii="Times New Roman"/>
@@ -10787,7 +10858,7 @@
           </w:tcPr>
           <w:p>
             <w:pPr>
-              <w:pStyle w:val="10"/>
+              <w:pStyle w:val="12"/>
               <w:spacing w:before="50"/>
               <w:ind w:left="4" w:right="1"/>
               <w:jc w:val="center"/>
@@ -10813,7 +10884,7 @@
           </w:tcPr>
           <w:p>
             <w:pPr>
-              <w:pStyle w:val="10"/>
+              <w:pStyle w:val="12"/>
               <w:ind w:left="0"/>
               <w:rPr>
                 <w:rFonts w:ascii="Times New Roman"/>
@@ -10834,7 +10905,7 @@
           </w:tcPr>
           <w:p>
             <w:pPr>
-              <w:pStyle w:val="10"/>
+              <w:pStyle w:val="12"/>
               <w:spacing w:before="50"/>
               <w:ind w:left="2"/>
               <w:jc w:val="center"/>
@@ -10866,7 +10937,7 @@
           </w:tcPr>
           <w:p>
             <w:pPr>
-              <w:pStyle w:val="10"/>
+              <w:pStyle w:val="12"/>
               <w:ind w:left="0"/>
               <w:rPr>
                 <w:rFonts w:ascii="Times New Roman"/>
@@ -10884,7 +10955,7 @@
           </w:tcPr>
           <w:p>
             <w:pPr>
-              <w:pStyle w:val="10"/>
+              <w:pStyle w:val="12"/>
               <w:spacing w:before="50"/>
               <w:ind w:left="1"/>
               <w:jc w:val="center"/>
@@ -10910,7 +10981,7 @@
           </w:tcPr>
           <w:p>
             <w:pPr>
-              <w:pStyle w:val="10"/>
+              <w:pStyle w:val="12"/>
               <w:ind w:left="0"/>
               <w:rPr>
                 <w:rFonts w:ascii="Times New Roman"/>
@@ -10928,7 +10999,7 @@
           </w:tcPr>
           <w:p>
             <w:pPr>
-              <w:pStyle w:val="10"/>
+              <w:pStyle w:val="12"/>
               <w:spacing w:before="50"/>
               <w:ind w:left="0" w:right="3"/>
               <w:rPr>
@@ -10953,7 +11024,7 @@
           </w:tcPr>
           <w:p>
             <w:pPr>
-              <w:pStyle w:val="10"/>
+              <w:pStyle w:val="12"/>
               <w:ind w:left="0"/>
               <w:rPr>
                 <w:rFonts w:ascii="Times New Roman"/>
@@ -10971,7 +11042,7 @@
           </w:tcPr>
           <w:p>
             <w:pPr>
-              <w:pStyle w:val="10"/>
+              <w:pStyle w:val="12"/>
               <w:spacing w:before="50"/>
               <w:ind w:left="2" w:right="5"/>
               <w:jc w:val="center"/>
@@ -11085,7 +11156,7 @@
           </w:tcPr>
           <w:p>
             <w:pPr>
-              <w:pStyle w:val="10"/>
+              <w:pStyle w:val="12"/>
               <w:spacing w:line="224" w:lineRule="exact"/>
               <w:ind w:left="10"/>
               <w:jc w:val="center"/>
@@ -11112,7 +11183,7 @@
           </w:tcPr>
           <w:p>
             <w:pPr>
-              <w:pStyle w:val="10"/>
+              <w:pStyle w:val="12"/>
               <w:spacing w:line="224" w:lineRule="exact"/>
               <w:ind w:left="854"/>
               <w:rPr>
@@ -11155,7 +11226,7 @@
           </w:tcPr>
           <w:p>
             <w:pPr>
-              <w:pStyle w:val="10"/>
+              <w:pStyle w:val="12"/>
               <w:spacing w:line="224" w:lineRule="exact"/>
               <w:ind w:left="990"/>
               <w:rPr>
@@ -11221,7 +11292,7 @@
           </w:tcPr>
           <w:p>
             <w:pPr>
-              <w:pStyle w:val="10"/>
+              <w:pStyle w:val="12"/>
               <w:spacing w:before="11"/>
               <w:ind w:left="0"/>
               <w:rPr>
@@ -11231,7 +11302,7 @@
           </w:p>
           <w:p>
             <w:pPr>
-              <w:pStyle w:val="10"/>
+              <w:pStyle w:val="12"/>
               <w:rPr>
                 <w:sz w:val="18"/>
               </w:rPr>
@@ -11251,7 +11322,7 @@
           </w:tcPr>
           <w:p>
             <w:pPr>
-              <w:pStyle w:val="10"/>
+              <w:pStyle w:val="12"/>
               <w:spacing w:before="11"/>
               <w:ind w:left="0"/>
               <w:rPr>
@@ -11261,7 +11332,7 @@
           </w:p>
           <w:p>
             <w:pPr>
-              <w:pStyle w:val="10"/>
+              <w:pStyle w:val="12"/>
               <w:rPr>
                 <w:sz w:val="18"/>
               </w:rPr>
@@ -11295,7 +11366,7 @@
           </w:tcPr>
           <w:p>
             <w:pPr>
-              <w:pStyle w:val="10"/>
+              <w:pStyle w:val="12"/>
               <w:spacing w:before="1" w:line="252" w:lineRule="auto"/>
               <w:ind w:left="108"/>
               <w:rPr>
@@ -11402,7 +11473,7 @@
           </w:p>
           <w:p>
             <w:pPr>
-              <w:pStyle w:val="10"/>
+              <w:pStyle w:val="12"/>
               <w:spacing w:line="199" w:lineRule="exact"/>
               <w:ind w:left="108"/>
               <w:rPr>
@@ -11429,7 +11500,7 @@
           </w:tcPr>
           <w:p>
             <w:pPr>
-              <w:pStyle w:val="10"/>
+              <w:pStyle w:val="12"/>
               <w:spacing w:before="10"/>
               <w:ind w:left="0"/>
               <w:rPr>
@@ -11439,7 +11510,7 @@
           </w:p>
           <w:p>
             <w:pPr>
-              <w:pStyle w:val="10"/>
+              <w:pStyle w:val="12"/>
               <w:rPr>
                 <w:sz w:val="18"/>
               </w:rPr>
@@ -11459,7 +11530,7 @@
           </w:tcPr>
           <w:p>
             <w:pPr>
-              <w:pStyle w:val="10"/>
+              <w:pStyle w:val="12"/>
               <w:spacing w:before="10"/>
               <w:ind w:left="0"/>
               <w:rPr>
@@ -11469,7 +11540,7 @@
           </w:p>
           <w:p>
             <w:pPr>
-              <w:pStyle w:val="10"/>
+              <w:pStyle w:val="12"/>
               <w:rPr>
                 <w:sz w:val="18"/>
               </w:rPr>
@@ -11503,7 +11574,7 @@
           </w:tcPr>
           <w:p>
             <w:pPr>
-              <w:pStyle w:val="10"/>
+              <w:pStyle w:val="12"/>
               <w:ind w:left="108"/>
               <w:rPr>
                 <w:sz w:val="18"/>
@@ -11575,7 +11646,7 @@
           </w:p>
           <w:p>
             <w:pPr>
-              <w:pStyle w:val="10"/>
+              <w:pStyle w:val="12"/>
               <w:spacing w:line="220" w:lineRule="atLeast"/>
               <w:ind w:left="108"/>
               <w:rPr>
@@ -11677,7 +11748,7 @@
           </w:tcPr>
           <w:p>
             <w:pPr>
-              <w:pStyle w:val="10"/>
+              <w:pStyle w:val="12"/>
               <w:spacing w:before="11"/>
               <w:ind w:left="0"/>
               <w:rPr>
@@ -11687,7 +11758,7 @@
           </w:p>
           <w:p>
             <w:pPr>
-              <w:pStyle w:val="10"/>
+              <w:pStyle w:val="12"/>
               <w:rPr>
                 <w:sz w:val="18"/>
               </w:rPr>
@@ -11707,7 +11778,7 @@
           </w:tcPr>
           <w:p>
             <w:pPr>
-              <w:pStyle w:val="10"/>
+              <w:pStyle w:val="12"/>
               <w:spacing w:before="11"/>
               <w:ind w:left="0"/>
               <w:rPr>
@@ -11717,7 +11788,7 @@
           </w:p>
           <w:p>
             <w:pPr>
-              <w:pStyle w:val="10"/>
+              <w:pStyle w:val="12"/>
               <w:rPr>
                 <w:sz w:val="18"/>
               </w:rPr>
@@ -11751,7 +11822,7 @@
           </w:tcPr>
           <w:p>
             <w:pPr>
-              <w:pStyle w:val="10"/>
+              <w:pStyle w:val="12"/>
               <w:spacing w:before="1" w:line="252" w:lineRule="auto"/>
               <w:ind w:left="108"/>
               <w:rPr>
@@ -11896,7 +11967,7 @@
           </w:p>
           <w:p>
             <w:pPr>
-              <w:pStyle w:val="10"/>
+              <w:pStyle w:val="12"/>
               <w:spacing w:line="199" w:lineRule="exact"/>
               <w:ind w:left="108"/>
               <w:rPr>
@@ -11923,7 +11994,7 @@
           </w:tcPr>
           <w:p>
             <w:pPr>
-              <w:pStyle w:val="10"/>
+              <w:pStyle w:val="12"/>
               <w:spacing w:before="11"/>
               <w:ind w:left="0"/>
               <w:rPr>
@@ -11933,7 +12004,7 @@
           </w:p>
           <w:p>
             <w:pPr>
-              <w:pStyle w:val="10"/>
+              <w:pStyle w:val="12"/>
               <w:rPr>
                 <w:sz w:val="18"/>
               </w:rPr>
@@ -11953,7 +12024,7 @@
           </w:tcPr>
           <w:p>
             <w:pPr>
-              <w:pStyle w:val="10"/>
+              <w:pStyle w:val="12"/>
               <w:spacing w:before="11"/>
               <w:ind w:left="0"/>
               <w:rPr>
@@ -11963,7 +12034,7 @@
           </w:p>
           <w:p>
             <w:pPr>
-              <w:pStyle w:val="10"/>
+              <w:pStyle w:val="12"/>
               <w:rPr>
                 <w:sz w:val="18"/>
               </w:rPr>
@@ -11997,7 +12068,7 @@
           </w:tcPr>
           <w:p>
             <w:pPr>
-              <w:pStyle w:val="10"/>
+              <w:pStyle w:val="12"/>
               <w:ind w:left="108"/>
               <w:rPr>
                 <w:sz w:val="18"/>
@@ -12069,7 +12140,7 @@
           </w:p>
           <w:p>
             <w:pPr>
-              <w:pStyle w:val="10"/>
+              <w:pStyle w:val="12"/>
               <w:spacing w:line="220" w:lineRule="atLeast"/>
               <w:ind w:left="108"/>
               <w:rPr>
@@ -12103,7 +12174,7 @@
           </w:tcPr>
           <w:p>
             <w:pPr>
-              <w:pStyle w:val="10"/>
+              <w:pStyle w:val="12"/>
               <w:spacing w:before="10"/>
               <w:ind w:left="0"/>
               <w:rPr>
@@ -12113,7 +12184,7 @@
           </w:p>
           <w:p>
             <w:pPr>
-              <w:pStyle w:val="10"/>
+              <w:pStyle w:val="12"/>
               <w:rPr>
                 <w:sz w:val="18"/>
               </w:rPr>
@@ -12133,7 +12204,7 @@
           </w:tcPr>
           <w:p>
             <w:pPr>
-              <w:pStyle w:val="10"/>
+              <w:pStyle w:val="12"/>
               <w:spacing w:before="10"/>
               <w:ind w:left="0"/>
               <w:rPr>
@@ -12143,7 +12214,7 @@
           </w:p>
           <w:p>
             <w:pPr>
-              <w:pStyle w:val="10"/>
+              <w:pStyle w:val="12"/>
               <w:rPr>
                 <w:sz w:val="18"/>
               </w:rPr>
@@ -12177,7 +12248,7 @@
           </w:tcPr>
           <w:p>
             <w:pPr>
-              <w:pStyle w:val="10"/>
+              <w:pStyle w:val="12"/>
               <w:spacing w:line="252" w:lineRule="auto"/>
               <w:ind w:left="108"/>
               <w:rPr>
@@ -12256,7 +12327,7 @@
           </w:p>
           <w:p>
             <w:pPr>
-              <w:pStyle w:val="10"/>
+              <w:pStyle w:val="12"/>
               <w:spacing w:line="199" w:lineRule="exact"/>
               <w:ind w:left="108"/>
               <w:rPr>
@@ -12283,7 +12354,7 @@
           </w:tcPr>
           <w:p>
             <w:pPr>
-              <w:pStyle w:val="10"/>
+              <w:pStyle w:val="12"/>
               <w:spacing w:before="110"/>
               <w:ind w:left="0"/>
               <w:rPr>
@@ -12305,7 +12376,7 @@
           </w:tcPr>
           <w:p>
             <w:pPr>
-              <w:pStyle w:val="10"/>
+              <w:pStyle w:val="12"/>
               <w:spacing w:before="110"/>
               <w:rPr>
                 <w:sz w:val="18"/>
@@ -12340,7 +12411,7 @@
           </w:tcPr>
           <w:p>
             <w:pPr>
-              <w:pStyle w:val="10"/>
+              <w:pStyle w:val="12"/>
               <w:spacing w:before="1"/>
               <w:ind w:left="108"/>
               <w:rPr>
@@ -12399,7 +12470,7 @@
           </w:p>
           <w:p>
             <w:pPr>
-              <w:pStyle w:val="10"/>
+              <w:pStyle w:val="12"/>
               <w:spacing w:before="10" w:line="199" w:lineRule="exact"/>
               <w:ind w:left="108"/>
               <w:rPr>
@@ -12496,7 +12567,7 @@
           </w:tcPr>
           <w:p>
             <w:pPr>
-              <w:pStyle w:val="10"/>
+              <w:pStyle w:val="12"/>
               <w:spacing w:before="110"/>
               <w:rPr>
                 <w:sz w:val="18"/>
@@ -12517,7 +12588,7 @@
           </w:tcPr>
           <w:p>
             <w:pPr>
-              <w:pStyle w:val="10"/>
+              <w:pStyle w:val="12"/>
               <w:spacing w:before="110"/>
               <w:rPr>
                 <w:sz w:val="18"/>
@@ -12551,7 +12622,7 @@
           </w:tcPr>
           <w:p>
             <w:pPr>
-              <w:pStyle w:val="10"/>
+              <w:pStyle w:val="12"/>
               <w:ind w:left="108"/>
               <w:rPr>
                 <w:sz w:val="18"/>
@@ -12609,7 +12680,7 @@
           </w:p>
           <w:p>
             <w:pPr>
-              <w:pStyle w:val="10"/>
+              <w:pStyle w:val="12"/>
               <w:spacing w:before="10" w:line="200" w:lineRule="exact"/>
               <w:ind w:left="108"/>
               <w:rPr>
@@ -12664,7 +12735,7 @@
           </w:tcPr>
           <w:p>
             <w:pPr>
-              <w:pStyle w:val="10"/>
+              <w:pStyle w:val="12"/>
               <w:spacing w:before="10"/>
               <w:ind w:left="0"/>
               <w:rPr>
@@ -12674,7 +12745,7 @@
           </w:p>
           <w:p>
             <w:pPr>
-              <w:pStyle w:val="10"/>
+              <w:pStyle w:val="12"/>
               <w:rPr>
                 <w:sz w:val="18"/>
               </w:rPr>
@@ -12694,7 +12765,7 @@
           </w:tcPr>
           <w:p>
             <w:pPr>
-              <w:pStyle w:val="10"/>
+              <w:pStyle w:val="12"/>
               <w:spacing w:before="10"/>
               <w:ind w:left="0"/>
               <w:rPr>
@@ -12704,7 +12775,7 @@
           </w:p>
           <w:p>
             <w:pPr>
-              <w:pStyle w:val="10"/>
+              <w:pStyle w:val="12"/>
               <w:rPr>
                 <w:sz w:val="18"/>
               </w:rPr>
@@ -12752,7 +12823,7 @@
           </w:tcPr>
           <w:p>
             <w:pPr>
-              <w:pStyle w:val="10"/>
+              <w:pStyle w:val="12"/>
               <w:spacing w:line="252" w:lineRule="auto"/>
               <w:ind w:left="108"/>
               <w:rPr>
@@ -12857,7 +12928,7 @@
           </w:p>
           <w:p>
             <w:pPr>
-              <w:pStyle w:val="10"/>
+              <w:pStyle w:val="12"/>
               <w:spacing w:line="199" w:lineRule="exact"/>
               <w:ind w:left="108"/>
               <w:rPr>
@@ -13397,7 +13468,7 @@
           </w:tcPr>
           <w:p>
             <w:pPr>
-              <w:pStyle w:val="10"/>
+              <w:pStyle w:val="12"/>
               <w:spacing w:line="224" w:lineRule="exact"/>
               <w:ind w:left="9"/>
               <w:jc w:val="center"/>
@@ -13424,7 +13495,7 @@
           </w:tcPr>
           <w:p>
             <w:pPr>
-              <w:pStyle w:val="10"/>
+              <w:pStyle w:val="12"/>
               <w:spacing w:line="224" w:lineRule="exact"/>
               <w:ind w:left="531"/>
               <w:rPr>
@@ -13468,7 +13539,7 @@
           </w:tcPr>
           <w:p>
             <w:pPr>
-              <w:pStyle w:val="10"/>
+              <w:pStyle w:val="12"/>
               <w:spacing w:line="224" w:lineRule="exact"/>
               <w:ind w:left="414"/>
               <w:rPr>
@@ -13530,7 +13601,7 @@
           </w:tcPr>
           <w:p>
             <w:pPr>
-              <w:pStyle w:val="10"/>
+              <w:pStyle w:val="12"/>
               <w:spacing w:line="224" w:lineRule="exact"/>
               <w:ind w:left="603"/>
               <w:rPr>
@@ -13560,7 +13631,7 @@
           </w:tcPr>
           <w:p>
             <w:pPr>
-              <w:pStyle w:val="10"/>
+              <w:pStyle w:val="12"/>
               <w:spacing w:before="110"/>
               <w:rPr>
                 <w:sz w:val="18"/>
@@ -13609,7 +13680,7 @@
           </w:tcPr>
           <w:p>
             <w:pPr>
-              <w:pStyle w:val="10"/>
+              <w:pStyle w:val="12"/>
               <w:spacing w:before="110"/>
               <w:ind w:left="108"/>
               <w:rPr>
@@ -13631,7 +13702,7 @@
           </w:tcPr>
           <w:p>
             <w:pPr>
-              <w:pStyle w:val="10"/>
+              <w:pStyle w:val="12"/>
               <w:spacing w:before="110"/>
               <w:ind w:left="108"/>
               <w:rPr>
@@ -13681,7 +13752,7 @@
           </w:tcPr>
           <w:p>
             <w:pPr>
-              <w:pStyle w:val="10"/>
+              <w:pStyle w:val="12"/>
               <w:rPr>
                 <w:sz w:val="18"/>
               </w:rPr>
@@ -13752,7 +13823,7 @@
           </w:p>
           <w:p>
             <w:pPr>
-              <w:pStyle w:val="10"/>
+              <w:pStyle w:val="12"/>
               <w:spacing w:before="10" w:line="199" w:lineRule="exact"/>
               <w:rPr>
                 <w:sz w:val="18"/>
@@ -13820,7 +13891,7 @@
           </w:tcPr>
           <w:p>
             <w:pPr>
-              <w:pStyle w:val="10"/>
+              <w:pStyle w:val="12"/>
               <w:spacing w:before="110"/>
               <w:rPr>
                 <w:sz w:val="18"/>
@@ -13869,7 +13940,7 @@
           </w:tcPr>
           <w:p>
             <w:pPr>
-              <w:pStyle w:val="10"/>
+              <w:pStyle w:val="12"/>
               <w:spacing w:before="110"/>
               <w:ind w:left="108"/>
               <w:rPr>
@@ -13922,7 +13993,7 @@
           </w:tcPr>
           <w:p>
             <w:pPr>
-              <w:pStyle w:val="10"/>
+              <w:pStyle w:val="12"/>
               <w:spacing w:before="110"/>
               <w:ind w:left="108"/>
               <w:rPr>
@@ -13972,7 +14043,7 @@
           </w:tcPr>
           <w:p>
             <w:pPr>
-              <w:pStyle w:val="10"/>
+              <w:pStyle w:val="12"/>
               <w:spacing w:before="1"/>
               <w:rPr>
                 <w:sz w:val="18"/>
@@ -14058,7 +14129,7 @@
           </w:p>
           <w:p>
             <w:pPr>
-              <w:pStyle w:val="10"/>
+              <w:pStyle w:val="12"/>
               <w:spacing w:before="10" w:line="199" w:lineRule="exact"/>
               <w:rPr>
                 <w:sz w:val="18"/>
@@ -14099,7 +14170,7 @@
           </w:tcPr>
           <w:p>
             <w:pPr>
-              <w:pStyle w:val="10"/>
+              <w:pStyle w:val="12"/>
               <w:spacing w:before="10"/>
               <w:ind w:left="0"/>
               <w:rPr>
@@ -14109,7 +14180,7 @@
           </w:p>
           <w:p>
             <w:pPr>
-              <w:pStyle w:val="10"/>
+              <w:pStyle w:val="12"/>
               <w:rPr>
                 <w:sz w:val="18"/>
               </w:rPr>
@@ -14157,7 +14228,7 @@
           </w:tcPr>
           <w:p>
             <w:pPr>
-              <w:pStyle w:val="10"/>
+              <w:pStyle w:val="12"/>
               <w:spacing w:before="10"/>
               <w:ind w:left="0"/>
               <w:rPr>
@@ -14167,7 +14238,7 @@
           </w:p>
           <w:p>
             <w:pPr>
-              <w:pStyle w:val="10"/>
+              <w:pStyle w:val="12"/>
               <w:ind w:left="108"/>
               <w:rPr>
                 <w:sz w:val="18"/>
@@ -14219,7 +14290,7 @@
           </w:tcPr>
           <w:p>
             <w:pPr>
-              <w:pStyle w:val="10"/>
+              <w:pStyle w:val="12"/>
               <w:spacing w:before="10"/>
               <w:ind w:left="0"/>
               <w:rPr>
@@ -14229,7 +14300,7 @@
           </w:p>
           <w:p>
             <w:pPr>
-              <w:pStyle w:val="10"/>
+              <w:pStyle w:val="12"/>
               <w:ind w:left="108"/>
               <w:rPr>
                 <w:sz w:val="18"/>
@@ -14278,7 +14349,7 @@
           </w:tcPr>
           <w:p>
             <w:pPr>
-              <w:pStyle w:val="10"/>
+              <w:pStyle w:val="12"/>
               <w:spacing w:line="252" w:lineRule="auto"/>
               <w:rPr>
                 <w:sz w:val="18"/>
@@ -14342,7 +14413,7 @@
           </w:p>
           <w:p>
             <w:pPr>
-              <w:pStyle w:val="10"/>
+              <w:pStyle w:val="12"/>
               <w:spacing w:line="200" w:lineRule="exact"/>
               <w:rPr>
                 <w:sz w:val="18"/>
@@ -14382,7 +14453,7 @@
           </w:tcPr>
           <w:p>
             <w:pPr>
-              <w:pStyle w:val="10"/>
+              <w:pStyle w:val="12"/>
               <w:spacing w:before="109"/>
               <w:rPr>
                 <w:sz w:val="18"/>
@@ -14431,7 +14502,7 @@
           </w:tcPr>
           <w:p>
             <w:pPr>
-              <w:pStyle w:val="10"/>
+              <w:pStyle w:val="12"/>
               <w:spacing w:before="109"/>
               <w:ind w:left="108"/>
               <w:rPr>
@@ -14484,7 +14555,7 @@
           </w:tcPr>
           <w:p>
             <w:pPr>
-              <w:pStyle w:val="10"/>
+              <w:pStyle w:val="12"/>
               <w:spacing w:before="109"/>
               <w:ind w:left="108"/>
               <w:rPr>
@@ -14534,7 +14605,7 @@
           </w:tcPr>
           <w:p>
             <w:pPr>
-              <w:pStyle w:val="10"/>
+              <w:pStyle w:val="12"/>
               <w:rPr>
                 <w:sz w:val="18"/>
               </w:rPr>
@@ -14605,7 +14676,7 @@
           </w:p>
           <w:p>
             <w:pPr>
-              <w:pStyle w:val="10"/>
+              <w:pStyle w:val="12"/>
               <w:spacing w:before="10" w:line="199" w:lineRule="exact"/>
               <w:rPr>
                 <w:sz w:val="18"/>
@@ -14659,7 +14730,7 @@
           </w:tcPr>
           <w:p>
             <w:pPr>
-              <w:pStyle w:val="10"/>
+              <w:pStyle w:val="12"/>
               <w:spacing w:before="110"/>
               <w:rPr>
                 <w:sz w:val="18"/>
@@ -14709,7 +14780,7 @@
           </w:tcPr>
           <w:p>
             <w:pPr>
-              <w:pStyle w:val="10"/>
+              <w:pStyle w:val="12"/>
               <w:spacing w:before="110"/>
               <w:ind w:left="108"/>
               <w:rPr>
@@ -14738,7 +14809,7 @@
           </w:tcPr>
           <w:p>
             <w:pPr>
-              <w:pStyle w:val="10"/>
+              <w:pStyle w:val="12"/>
               <w:spacing w:before="110"/>
               <w:ind w:left="108"/>
               <w:rPr>
@@ -14788,7 +14859,7 @@
           </w:tcPr>
           <w:p>
             <w:pPr>
-              <w:pStyle w:val="10"/>
+              <w:pStyle w:val="12"/>
               <w:rPr>
                 <w:sz w:val="18"/>
               </w:rPr>
@@ -14859,7 +14930,7 @@
           </w:p>
           <w:p>
             <w:pPr>
-              <w:pStyle w:val="10"/>
+              <w:pStyle w:val="12"/>
               <w:spacing w:before="11" w:line="199" w:lineRule="exact"/>
               <w:rPr>
                 <w:sz w:val="18"/>
@@ -15371,7 +15442,7 @@
           </w:tcPr>
           <w:p>
             <w:pPr>
-              <w:pStyle w:val="10"/>
+              <w:pStyle w:val="12"/>
               <w:spacing w:line="224" w:lineRule="exact"/>
               <w:ind w:left="1062"/>
               <w:rPr>
@@ -15397,7 +15468,7 @@
           </w:tcPr>
           <w:p>
             <w:pPr>
-              <w:pStyle w:val="10"/>
+              <w:pStyle w:val="12"/>
               <w:spacing w:line="224" w:lineRule="exact"/>
               <w:ind w:left="9"/>
               <w:jc w:val="center"/>
@@ -15424,7 +15495,7 @@
           </w:tcPr>
           <w:p>
             <w:pPr>
-              <w:pStyle w:val="10"/>
+              <w:pStyle w:val="12"/>
               <w:spacing w:line="224" w:lineRule="exact"/>
               <w:ind w:left="986"/>
               <w:rPr>
@@ -15471,7 +15542,7 @@
           </w:tcPr>
           <w:p>
             <w:pPr>
-              <w:pStyle w:val="10"/>
+              <w:pStyle w:val="12"/>
               <w:spacing w:line="252" w:lineRule="auto"/>
               <w:rPr>
                 <w:sz w:val="18"/>
@@ -15554,7 +15625,7 @@
           </w:tcPr>
           <w:p>
             <w:pPr>
-              <w:pStyle w:val="10"/>
+              <w:pStyle w:val="12"/>
               <w:spacing w:line="252" w:lineRule="auto"/>
               <w:ind w:right="152"/>
               <w:rPr>
@@ -15625,7 +15696,7 @@
           </w:p>
           <w:p>
             <w:pPr>
-              <w:pStyle w:val="10"/>
+              <w:pStyle w:val="12"/>
               <w:spacing w:line="200" w:lineRule="exact"/>
               <w:rPr>
                 <w:sz w:val="18"/>
@@ -15684,7 +15755,7 @@
           </w:tcPr>
           <w:p>
             <w:pPr>
-              <w:pStyle w:val="10"/>
+              <w:pStyle w:val="12"/>
               <w:spacing w:before="110" w:line="252" w:lineRule="auto"/>
               <w:rPr>
                 <w:sz w:val="18"/>
@@ -15843,7 +15914,7 @@
           </w:tcPr>
           <w:p>
             <w:pPr>
-              <w:pStyle w:val="10"/>
+              <w:pStyle w:val="12"/>
               <w:spacing w:line="224" w:lineRule="exact"/>
               <w:ind w:left="11" w:right="3"/>
               <w:jc w:val="center"/>
@@ -15870,7 +15941,7 @@
           </w:tcPr>
           <w:p>
             <w:pPr>
-              <w:pStyle w:val="10"/>
+              <w:pStyle w:val="12"/>
               <w:spacing w:line="224" w:lineRule="exact"/>
               <w:ind w:left="7"/>
               <w:jc w:val="center"/>
@@ -15897,7 +15968,7 @@
           </w:tcPr>
           <w:p>
             <w:pPr>
-              <w:pStyle w:val="10"/>
+              <w:pStyle w:val="12"/>
               <w:spacing w:line="224" w:lineRule="exact"/>
               <w:ind w:left="11"/>
               <w:jc w:val="center"/>
@@ -15942,7 +16013,7 @@
           </w:tcPr>
           <w:p>
             <w:pPr>
-              <w:pStyle w:val="10"/>
+              <w:pStyle w:val="12"/>
               <w:spacing w:line="224" w:lineRule="exact"/>
               <w:ind w:left="11" w:right="1"/>
               <w:jc w:val="center"/>
@@ -15970,7 +16041,7 @@
           </w:tcPr>
           <w:p>
             <w:pPr>
-              <w:pStyle w:val="10"/>
+              <w:pStyle w:val="12"/>
               <w:spacing w:line="224" w:lineRule="exact"/>
               <w:ind w:left="9"/>
               <w:jc w:val="center"/>
@@ -16001,7 +16072,7 @@
           </w:tcPr>
           <w:p>
             <w:pPr>
-              <w:pStyle w:val="10"/>
+              <w:pStyle w:val="12"/>
               <w:spacing w:line="199" w:lineRule="exact"/>
               <w:ind w:left="11" w:right="3"/>
               <w:jc w:val="center"/>
@@ -16024,7 +16095,7 @@
           </w:tcPr>
           <w:p>
             <w:pPr>
-              <w:pStyle w:val="10"/>
+              <w:pStyle w:val="12"/>
               <w:spacing w:line="199" w:lineRule="exact"/>
               <w:rPr>
                 <w:sz w:val="18"/>
@@ -16045,7 +16116,7 @@
           </w:tcPr>
           <w:p>
             <w:pPr>
-              <w:pStyle w:val="10"/>
+              <w:pStyle w:val="12"/>
               <w:spacing w:line="199" w:lineRule="exact"/>
               <w:ind w:left="11" w:right="2"/>
               <w:jc w:val="center"/>
@@ -16068,7 +16139,7 @@
           </w:tcPr>
           <w:p>
             <w:pPr>
-              <w:pStyle w:val="10"/>
+              <w:pStyle w:val="12"/>
               <w:spacing w:line="199" w:lineRule="exact"/>
               <w:ind w:left="11" w:right="1"/>
               <w:jc w:val="center"/>
@@ -16091,7 +16162,7 @@
           </w:tcPr>
           <w:p>
             <w:pPr>
-              <w:pStyle w:val="10"/>
+              <w:pStyle w:val="12"/>
               <w:spacing w:line="199" w:lineRule="exact"/>
               <w:ind w:left="9"/>
               <w:jc w:val="center"/>
@@ -16119,7 +16190,7 @@
           </w:tcPr>
           <w:p>
             <w:pPr>
-              <w:pStyle w:val="10"/>
+              <w:pStyle w:val="12"/>
               <w:spacing w:before="1" w:line="199" w:lineRule="exact"/>
               <w:ind w:left="11" w:right="3"/>
               <w:jc w:val="center"/>
@@ -16142,7 +16213,7 @@
           </w:tcPr>
           <w:p>
             <w:pPr>
-              <w:pStyle w:val="10"/>
+              <w:pStyle w:val="12"/>
               <w:spacing w:before="1" w:line="199" w:lineRule="exact"/>
               <w:rPr>
                 <w:sz w:val="18"/>
@@ -16194,7 +16265,7 @@
           </w:tcPr>
           <w:p>
             <w:pPr>
-              <w:pStyle w:val="10"/>
+              <w:pStyle w:val="12"/>
               <w:spacing w:before="1" w:line="199" w:lineRule="exact"/>
               <w:ind w:left="11" w:right="2"/>
               <w:jc w:val="center"/>
@@ -16217,7 +16288,7 @@
           </w:tcPr>
           <w:p>
             <w:pPr>
-              <w:pStyle w:val="10"/>
+              <w:pStyle w:val="12"/>
               <w:spacing w:before="1" w:line="199" w:lineRule="exact"/>
               <w:ind w:left="11" w:right="1"/>
               <w:jc w:val="center"/>
@@ -16231,42 +16302,6 @@
                 <w:sz w:val="18"/>
               </w:rPr>
               <w:t>11</w:t>
-            </w:r>
-            <w:r>
-              <w:rPr>
-                <w:spacing w:val="-16"/>
-                <w:sz w:val="18"/>
-              </w:rPr>
-            </w:r>
-            <w:r>
-              <w:rPr>
-                <w:spacing w:val="-4"/>
-                <w:sz w:val="18"/>
-              </w:rPr>
-            </w:r>
-            <w:r>
-              <w:rPr>
-                <w:spacing w:val="-15"/>
-                <w:sz w:val="18"/>
-              </w:rPr>
-            </w:r>
-            <w:r>
-              <w:rPr>
-                <w:spacing w:val="-4"/>
-                <w:sz w:val="18"/>
-              </w:rPr>
-            </w:r>
-            <w:r>
-              <w:rPr>
-                <w:spacing w:val="-15"/>
-                <w:sz w:val="18"/>
-              </w:rPr>
-            </w:r>
-            <w:r>
-              <w:rPr>
-                <w:spacing w:val="-5"/>
-                <w:sz w:val="18"/>
-              </w:rPr>
             </w:r>
           </w:p>
         </w:tc>
@@ -16276,7 +16311,7 @@
           </w:tcPr>
           <w:p>
             <w:pPr>
-              <w:pStyle w:val="10"/>
+              <w:pStyle w:val="12"/>
               <w:spacing w:before="1" w:line="199" w:lineRule="exact"/>
               <w:ind w:left="9"/>
               <w:jc w:val="center"/>
@@ -16304,7 +16339,7 @@
           </w:tcPr>
           <w:p>
             <w:pPr>
-              <w:pStyle w:val="10"/>
+              <w:pStyle w:val="12"/>
               <w:spacing w:line="200" w:lineRule="exact"/>
               <w:ind w:left="11" w:right="3"/>
               <w:jc w:val="center"/>
@@ -16327,7 +16362,7 @@
           </w:tcPr>
           <w:p>
             <w:pPr>
-              <w:pStyle w:val="10"/>
+              <w:pStyle w:val="12"/>
               <w:spacing w:line="200" w:lineRule="exact"/>
               <w:rPr>
                 <w:sz w:val="18"/>
@@ -16401,7 +16436,7 @@
           </w:tcPr>
           <w:p>
             <w:pPr>
-              <w:pStyle w:val="10"/>
+              <w:pStyle w:val="12"/>
               <w:spacing w:line="200" w:lineRule="exact"/>
               <w:ind w:left="11" w:right="2"/>
               <w:jc w:val="center"/>
@@ -16424,7 +16459,7 @@
           </w:tcPr>
           <w:p>
             <w:pPr>
-              <w:pStyle w:val="10"/>
+              <w:pStyle w:val="12"/>
               <w:spacing w:line="200" w:lineRule="exact"/>
               <w:ind w:left="11" w:right="1"/>
               <w:jc w:val="center"/>
@@ -16438,42 +16473,6 @@
                 <w:sz w:val="18"/>
               </w:rPr>
               <w:t>12</w:t>
-            </w:r>
-            <w:r>
-              <w:rPr>
-                <w:spacing w:val="-16"/>
-                <w:sz w:val="18"/>
-              </w:rPr>
-            </w:r>
-            <w:r>
-              <w:rPr>
-                <w:spacing w:val="-4"/>
-                <w:sz w:val="18"/>
-              </w:rPr>
-            </w:r>
-            <w:r>
-              <w:rPr>
-                <w:spacing w:val="-15"/>
-                <w:sz w:val="18"/>
-              </w:rPr>
-            </w:r>
-            <w:r>
-              <w:rPr>
-                <w:spacing w:val="-4"/>
-                <w:sz w:val="18"/>
-              </w:rPr>
-            </w:r>
-            <w:r>
-              <w:rPr>
-                <w:spacing w:val="-15"/>
-                <w:sz w:val="18"/>
-              </w:rPr>
-            </w:r>
-            <w:r>
-              <w:rPr>
-                <w:spacing w:val="-5"/>
-                <w:sz w:val="18"/>
-              </w:rPr>
             </w:r>
           </w:p>
         </w:tc>
@@ -16483,7 +16482,7 @@
           </w:tcPr>
           <w:p>
             <w:pPr>
-              <w:pStyle w:val="10"/>
+              <w:pStyle w:val="12"/>
               <w:spacing w:line="200" w:lineRule="exact"/>
               <w:ind w:left="9"/>
               <w:jc w:val="center"/>
@@ -23114,7 +23113,7 @@
           </w:tcPr>
           <w:p>
             <w:pPr>
-              <w:pStyle w:val="10"/>
+              <w:pStyle w:val="12"/>
               <w:spacing w:line="224" w:lineRule="exact"/>
               <w:ind w:left="1062"/>
               <w:rPr>
@@ -23140,7 +23139,7 @@
           </w:tcPr>
           <w:p>
             <w:pPr>
-              <w:pStyle w:val="10"/>
+              <w:pStyle w:val="12"/>
               <w:spacing w:line="224" w:lineRule="exact"/>
               <w:ind w:left="9"/>
               <w:jc w:val="center"/>
@@ -23167,7 +23166,7 @@
           </w:tcPr>
           <w:p>
             <w:pPr>
-              <w:pStyle w:val="10"/>
+              <w:pStyle w:val="12"/>
               <w:spacing w:line="224" w:lineRule="exact"/>
               <w:ind w:left="986"/>
               <w:rPr>
@@ -23214,7 +23213,7 @@
           </w:tcPr>
           <w:p>
             <w:pPr>
-              <w:pStyle w:val="10"/>
+              <w:pStyle w:val="12"/>
               <w:spacing w:line="252" w:lineRule="auto"/>
               <w:ind w:right="172"/>
               <w:rPr>
@@ -23293,7 +23292,7 @@
           </w:p>
           <w:p>
             <w:pPr>
-              <w:pStyle w:val="10"/>
+              <w:pStyle w:val="12"/>
               <w:spacing w:line="200" w:lineRule="exact"/>
               <w:rPr>
                 <w:sz w:val="18"/>
@@ -23314,7 +23313,7 @@
           </w:tcPr>
           <w:p>
             <w:pPr>
-              <w:pStyle w:val="10"/>
+              <w:pStyle w:val="12"/>
               <w:spacing w:before="110" w:line="252" w:lineRule="auto"/>
               <w:rPr>
                 <w:sz w:val="18"/>
@@ -23587,7 +23586,7 @@
           </w:tcPr>
           <w:p>
             <w:pPr>
-              <w:pStyle w:val="10"/>
+              <w:pStyle w:val="12"/>
               <w:spacing w:before="110" w:line="252" w:lineRule="auto"/>
               <w:ind w:right="385"/>
               <w:rPr>
@@ -23799,7 +23798,7 @@
           </w:tcPr>
           <w:p>
             <w:pPr>
-              <w:pStyle w:val="10"/>
+              <w:pStyle w:val="12"/>
               <w:spacing w:line="224" w:lineRule="exact"/>
               <w:ind w:left="11" w:right="4"/>
               <w:jc w:val="center"/>
@@ -23826,7 +23825,7 @@
           </w:tcPr>
           <w:p>
             <w:pPr>
-              <w:pStyle w:val="10"/>
+              <w:pStyle w:val="12"/>
               <w:spacing w:line="224" w:lineRule="exact"/>
               <w:ind w:left="425"/>
               <w:rPr>
@@ -23870,7 +23869,7 @@
           </w:tcPr>
           <w:p>
             <w:pPr>
-              <w:pStyle w:val="10"/>
+              <w:pStyle w:val="12"/>
               <w:spacing w:line="224" w:lineRule="exact"/>
               <w:ind w:left="7"/>
               <w:jc w:val="center"/>
@@ -23897,7 +23896,7 @@
           </w:tcPr>
           <w:p>
             <w:pPr>
-              <w:pStyle w:val="10"/>
+              <w:pStyle w:val="12"/>
               <w:spacing w:line="224" w:lineRule="exact"/>
               <w:ind w:left="11"/>
               <w:jc w:val="center"/>
@@ -23924,7 +23923,7 @@
           </w:tcPr>
           <w:p>
             <w:pPr>
-              <w:pStyle w:val="10"/>
+              <w:pStyle w:val="12"/>
               <w:spacing w:line="224" w:lineRule="exact"/>
               <w:ind w:left="538"/>
               <w:rPr>
@@ -23954,7 +23953,7 @@
           </w:tcPr>
           <w:p>
             <w:pPr>
-              <w:pStyle w:val="10"/>
+              <w:pStyle w:val="12"/>
               <w:spacing w:before="110"/>
               <w:rPr>
                 <w:sz w:val="18"/>
@@ -23975,7 +23974,7 @@
           </w:tcPr>
           <w:p>
             <w:pPr>
-              <w:pStyle w:val="10"/>
+              <w:pStyle w:val="12"/>
               <w:spacing w:before="110"/>
               <w:ind w:left="106"/>
               <w:rPr>
@@ -23997,7 +23996,7 @@
           </w:tcPr>
           <w:p>
             <w:pPr>
-              <w:pStyle w:val="10"/>
+              <w:pStyle w:val="12"/>
               <w:spacing w:before="110"/>
               <w:rPr>
                 <w:sz w:val="18"/>
@@ -24018,7 +24017,7 @@
           </w:tcPr>
           <w:p>
             <w:pPr>
-              <w:pStyle w:val="10"/>
+              <w:pStyle w:val="12"/>
               <w:spacing w:before="110"/>
               <w:ind w:left="108"/>
               <w:rPr>
@@ -24040,7 +24039,7 @@
           </w:tcPr>
           <w:p>
             <w:pPr>
-              <w:pStyle w:val="10"/>
+              <w:pStyle w:val="12"/>
               <w:ind w:left="109"/>
               <w:rPr>
                 <w:sz w:val="18"/>
@@ -24084,7 +24083,7 @@
           </w:p>
           <w:p>
             <w:pPr>
-              <w:pStyle w:val="10"/>
+              <w:pStyle w:val="12"/>
               <w:spacing w:before="10" w:line="200" w:lineRule="exact"/>
               <w:ind w:left="109"/>
               <w:rPr>
@@ -24142,7 +24141,7 @@
           </w:tcPr>
           <w:p>
             <w:pPr>
-              <w:pStyle w:val="10"/>
+              <w:pStyle w:val="12"/>
               <w:spacing w:before="109"/>
               <w:rPr>
                 <w:sz w:val="18"/>
@@ -24163,7 +24162,7 @@
           </w:tcPr>
           <w:p>
             <w:pPr>
-              <w:pStyle w:val="10"/>
+              <w:pStyle w:val="12"/>
               <w:spacing w:before="109"/>
               <w:ind w:left="106"/>
               <w:rPr>
@@ -24213,7 +24212,7 @@
           </w:tcPr>
           <w:p>
             <w:pPr>
-              <w:pStyle w:val="10"/>
+              <w:pStyle w:val="12"/>
               <w:spacing w:before="109"/>
               <w:rPr>
                 <w:sz w:val="18"/>
@@ -24234,7 +24233,7 @@
           </w:tcPr>
           <w:p>
             <w:pPr>
-              <w:pStyle w:val="10"/>
+              <w:pStyle w:val="12"/>
               <w:spacing w:before="109"/>
               <w:ind w:left="108"/>
               <w:rPr>
@@ -24256,7 +24255,7 @@
           </w:tcPr>
           <w:p>
             <w:pPr>
-              <w:pStyle w:val="10"/>
+              <w:pStyle w:val="12"/>
               <w:ind w:left="109"/>
               <w:rPr>
                 <w:sz w:val="18"/>
@@ -24314,7 +24313,7 @@
           </w:p>
           <w:p>
             <w:pPr>
-              <w:pStyle w:val="10"/>
+              <w:pStyle w:val="12"/>
               <w:spacing w:before="10" w:line="199" w:lineRule="exact"/>
               <w:ind w:left="109"/>
               <w:rPr>
@@ -24356,7 +24355,7 @@
           </w:tcPr>
           <w:p>
             <w:pPr>
-              <w:pStyle w:val="10"/>
+              <w:pStyle w:val="12"/>
               <w:spacing w:before="110"/>
               <w:rPr>
                 <w:sz w:val="18"/>
@@ -24377,7 +24376,7 @@
           </w:tcPr>
           <w:p>
             <w:pPr>
-              <w:pStyle w:val="10"/>
+              <w:pStyle w:val="12"/>
               <w:ind w:left="106"/>
               <w:rPr>
                 <w:sz w:val="18"/>
@@ -24407,7 +24406,7 @@
           </w:p>
           <w:p>
             <w:pPr>
-              <w:pStyle w:val="10"/>
+              <w:pStyle w:val="12"/>
               <w:spacing w:before="10" w:line="200" w:lineRule="exact"/>
               <w:ind w:left="106"/>
               <w:rPr>
@@ -24429,7 +24428,7 @@
           </w:tcPr>
           <w:p>
             <w:pPr>
-              <w:pStyle w:val="10"/>
+              <w:pStyle w:val="12"/>
               <w:spacing w:before="110"/>
               <w:rPr>
                 <w:sz w:val="18"/>
@@ -24450,7 +24449,7 @@
           </w:tcPr>
           <w:p>
             <w:pPr>
-              <w:pStyle w:val="10"/>
+              <w:pStyle w:val="12"/>
               <w:spacing w:before="110"/>
               <w:ind w:left="108"/>
               <w:rPr>
@@ -24483,7 +24482,7 @@
           </w:tcPr>
           <w:p>
             <w:pPr>
-              <w:pStyle w:val="10"/>
+              <w:pStyle w:val="12"/>
               <w:ind w:left="109"/>
               <w:rPr>
                 <w:sz w:val="18"/>
@@ -24527,7 +24526,7 @@
           </w:p>
           <w:p>
             <w:pPr>
-              <w:pStyle w:val="10"/>
+              <w:pStyle w:val="12"/>
               <w:spacing w:before="10" w:line="200" w:lineRule="exact"/>
               <w:ind w:left="109"/>
               <w:rPr>
@@ -24567,7 +24566,7 @@
           </w:tcPr>
           <w:p>
             <w:pPr>
-              <w:pStyle w:val="10"/>
+              <w:pStyle w:val="12"/>
               <w:spacing w:before="10"/>
               <w:ind w:left="0"/>
               <w:rPr>
@@ -24577,7 +24576,7 @@
           </w:p>
           <w:p>
             <w:pPr>
-              <w:pStyle w:val="10"/>
+              <w:pStyle w:val="12"/>
               <w:rPr>
                 <w:sz w:val="18"/>
               </w:rPr>
@@ -24597,7 +24596,7 @@
           </w:tcPr>
           <w:p>
             <w:pPr>
-              <w:pStyle w:val="10"/>
+              <w:pStyle w:val="12"/>
               <w:spacing w:line="252" w:lineRule="auto"/>
               <w:ind w:left="106"/>
               <w:rPr>
@@ -24633,7 +24632,7 @@
           </w:p>
           <w:p>
             <w:pPr>
-              <w:pStyle w:val="10"/>
+              <w:pStyle w:val="12"/>
               <w:spacing w:line="199" w:lineRule="exact"/>
               <w:ind w:left="106"/>
               <w:rPr>
@@ -24656,7 +24655,7 @@
           </w:tcPr>
           <w:p>
             <w:pPr>
-              <w:pStyle w:val="10"/>
+              <w:pStyle w:val="12"/>
               <w:spacing w:before="10"/>
               <w:ind w:left="0"/>
               <w:rPr>
@@ -24666,7 +24665,7 @@
           </w:p>
           <w:p>
             <w:pPr>
-              <w:pStyle w:val="10"/>
+              <w:pStyle w:val="12"/>
               <w:rPr>
                 <w:sz w:val="18"/>
               </w:rPr>
@@ -24686,7 +24685,7 @@
           </w:tcPr>
           <w:p>
             <w:pPr>
-              <w:pStyle w:val="10"/>
+              <w:pStyle w:val="12"/>
               <w:spacing w:before="10"/>
               <w:ind w:left="0"/>
               <w:rPr>
@@ -24696,7 +24695,7 @@
           </w:p>
           <w:p>
             <w:pPr>
-              <w:pStyle w:val="10"/>
+              <w:pStyle w:val="12"/>
               <w:ind w:left="108"/>
               <w:rPr>
                 <w:sz w:val="18"/>
@@ -24717,7 +24716,7 @@
           </w:tcPr>
           <w:p>
             <w:pPr>
-              <w:pStyle w:val="10"/>
+              <w:pStyle w:val="12"/>
               <w:spacing w:before="109" w:line="254" w:lineRule="auto"/>
               <w:ind w:left="109"/>
               <w:rPr>
@@ -24729,70 +24728,6 @@
                 <w:sz w:val="18"/>
               </w:rPr>
               <w:t>Very small routed subset (6 test cases).</w:t>
-            </w:r>
-            <w:r>
-              <w:rPr>
-                <w:spacing w:val="-1"/>
-                <w:sz w:val="18"/>
-              </w:rPr>
-            </w:r>
-            <w:r>
-              <w:rPr>
-                <w:sz w:val="18"/>
-              </w:rPr>
-            </w:r>
-            <w:r>
-              <w:rPr>
-                <w:spacing w:val="-4"/>
-                <w:sz w:val="18"/>
-              </w:rPr>
-            </w:r>
-            <w:r>
-              <w:rPr>
-                <w:sz w:val="18"/>
-              </w:rPr>
-            </w:r>
-            <w:r>
-              <w:rPr>
-                <w:spacing w:val="-2"/>
-                <w:sz w:val="18"/>
-              </w:rPr>
-            </w:r>
-            <w:r>
-              <w:rPr>
-                <w:spacing w:val="-17"/>
-                <w:sz w:val="18"/>
-              </w:rPr>
-            </w:r>
-            <w:r>
-              <w:rPr>
-                <w:spacing w:val="-2"/>
-                <w:sz w:val="18"/>
-              </w:rPr>
-            </w:r>
-            <w:r>
-              <w:rPr>
-                <w:spacing w:val="-19"/>
-                <w:sz w:val="18"/>
-              </w:rPr>
-            </w:r>
-            <w:r>
-              <w:rPr>
-                <w:spacing w:val="-2"/>
-                <w:sz w:val="18"/>
-              </w:rPr>
-            </w:r>
-            <w:r>
-              <w:rPr>
-                <w:spacing w:val="-18"/>
-                <w:sz w:val="18"/>
-              </w:rPr>
-            </w:r>
-            <w:r>
-              <w:rPr>
-                <w:spacing w:val="-2"/>
-                <w:sz w:val="18"/>
-              </w:rPr>
             </w:r>
           </w:p>
         </w:tc>
@@ -24807,7 +24742,7 @@
           </w:tcPr>
           <w:p>
             <w:pPr>
-              <w:pStyle w:val="10"/>
+              <w:pStyle w:val="12"/>
               <w:spacing w:before="11"/>
               <w:ind w:left="0"/>
               <w:rPr>
@@ -24817,7 +24752,7 @@
           </w:p>
           <w:p>
             <w:pPr>
-              <w:pStyle w:val="10"/>
+              <w:pStyle w:val="12"/>
               <w:rPr>
                 <w:sz w:val="18"/>
               </w:rPr>
@@ -24837,7 +24772,7 @@
           </w:tcPr>
           <w:p>
             <w:pPr>
-              <w:pStyle w:val="10"/>
+              <w:pStyle w:val="12"/>
               <w:spacing w:before="1" w:line="252" w:lineRule="auto"/>
               <w:ind w:left="106" w:right="617"/>
               <w:rPr>
@@ -24875,7 +24810,7 @@
           </w:p>
           <w:p>
             <w:pPr>
-              <w:pStyle w:val="10"/>
+              <w:pStyle w:val="12"/>
               <w:spacing w:line="199" w:lineRule="exact"/>
               <w:ind w:left="106"/>
               <w:rPr>
@@ -24897,7 +24832,7 @@
           </w:tcPr>
           <w:p>
             <w:pPr>
-              <w:pStyle w:val="10"/>
+              <w:pStyle w:val="12"/>
               <w:spacing w:before="11"/>
               <w:ind w:left="0"/>
               <w:rPr>
@@ -24907,7 +24842,7 @@
           </w:p>
           <w:p>
             <w:pPr>
-              <w:pStyle w:val="10"/>
+              <w:pStyle w:val="12"/>
               <w:rPr>
                 <w:sz w:val="18"/>
               </w:rPr>
@@ -24927,7 +24862,7 @@
           </w:tcPr>
           <w:p>
             <w:pPr>
-              <w:pStyle w:val="10"/>
+              <w:pStyle w:val="12"/>
               <w:spacing w:before="11"/>
               <w:ind w:left="0"/>
               <w:rPr>
@@ -24937,7 +24872,7 @@
           </w:p>
           <w:p>
             <w:pPr>
-              <w:pStyle w:val="10"/>
+              <w:pStyle w:val="12"/>
               <w:ind w:left="108"/>
               <w:rPr>
                 <w:rFonts w:hint="default"/>
@@ -24961,7 +24896,7 @@
           </w:tcPr>
           <w:p>
             <w:pPr>
-              <w:pStyle w:val="10"/>
+              <w:pStyle w:val="12"/>
               <w:spacing w:before="110" w:line="252" w:lineRule="auto"/>
               <w:ind w:left="109"/>
               <w:rPr>
@@ -24973,70 +24908,6 @@
                 <w:sz w:val="18"/>
               </w:rPr>
               <w:t>Very small routed subset (7 test cases).</w:t>
-            </w:r>
-            <w:r>
-              <w:rPr>
-                <w:spacing w:val="-1"/>
-                <w:sz w:val="18"/>
-              </w:rPr>
-            </w:r>
-            <w:r>
-              <w:rPr>
-                <w:sz w:val="18"/>
-              </w:rPr>
-            </w:r>
-            <w:r>
-              <w:rPr>
-                <w:spacing w:val="-4"/>
-                <w:sz w:val="18"/>
-              </w:rPr>
-            </w:r>
-            <w:r>
-              <w:rPr>
-                <w:sz w:val="18"/>
-              </w:rPr>
-            </w:r>
-            <w:r>
-              <w:rPr>
-                <w:spacing w:val="-2"/>
-                <w:sz w:val="18"/>
-              </w:rPr>
-            </w:r>
-            <w:r>
-              <w:rPr>
-                <w:spacing w:val="-17"/>
-                <w:sz w:val="18"/>
-              </w:rPr>
-            </w:r>
-            <w:r>
-              <w:rPr>
-                <w:spacing w:val="-2"/>
-                <w:sz w:val="18"/>
-              </w:rPr>
-            </w:r>
-            <w:r>
-              <w:rPr>
-                <w:spacing w:val="-19"/>
-                <w:sz w:val="18"/>
-              </w:rPr>
-            </w:r>
-            <w:r>
-              <w:rPr>
-                <w:spacing w:val="-2"/>
-                <w:sz w:val="18"/>
-              </w:rPr>
-            </w:r>
-            <w:r>
-              <w:rPr>
-                <w:spacing w:val="-18"/>
-                <w:sz w:val="18"/>
-              </w:rPr>
-            </w:r>
-            <w:r>
-              <w:rPr>
-                <w:spacing w:val="-2"/>
-                <w:sz w:val="18"/>
-              </w:rPr>
             </w:r>
           </w:p>
         </w:tc>
@@ -25051,7 +24922,7 @@
           </w:tcPr>
           <w:p>
             <w:pPr>
-              <w:pStyle w:val="10"/>
+              <w:pStyle w:val="12"/>
               <w:spacing w:before="110"/>
               <w:rPr>
                 <w:sz w:val="18"/>
@@ -25072,7 +24943,7 @@
           </w:tcPr>
           <w:p>
             <w:pPr>
-              <w:pStyle w:val="10"/>
+              <w:pStyle w:val="12"/>
               <w:spacing w:before="110"/>
               <w:ind w:left="106"/>
               <w:rPr>
@@ -25122,7 +24993,7 @@
           </w:tcPr>
           <w:p>
             <w:pPr>
-              <w:pStyle w:val="10"/>
+              <w:pStyle w:val="12"/>
               <w:spacing w:before="110"/>
               <w:rPr>
                 <w:sz w:val="18"/>
@@ -25143,7 +25014,7 @@
           </w:tcPr>
           <w:p>
             <w:pPr>
-              <w:pStyle w:val="10"/>
+              <w:pStyle w:val="12"/>
               <w:spacing w:before="110"/>
               <w:ind w:left="108"/>
               <w:rPr>
@@ -25176,7 +25047,7 @@
           </w:tcPr>
           <w:p>
             <w:pPr>
-              <w:pStyle w:val="10"/>
+              <w:pStyle w:val="12"/>
               <w:ind w:left="109"/>
               <w:rPr>
                 <w:sz w:val="18"/>
@@ -25220,7 +25091,7 @@
           </w:p>
           <w:p>
             <w:pPr>
-              <w:pStyle w:val="10"/>
+              <w:pStyle w:val="12"/>
               <w:spacing w:before="10" w:line="199" w:lineRule="exact"/>
               <w:ind w:left="109"/>
               <w:rPr>
@@ -25261,7 +25132,7 @@
           </w:tcPr>
           <w:p>
             <w:pPr>
-              <w:pStyle w:val="10"/>
+              <w:pStyle w:val="12"/>
               <w:spacing w:before="11"/>
               <w:ind w:left="0"/>
               <w:rPr>
@@ -25271,7 +25142,7 @@
           </w:p>
           <w:p>
             <w:pPr>
-              <w:pStyle w:val="10"/>
+              <w:pStyle w:val="12"/>
               <w:rPr>
                 <w:sz w:val="18"/>
               </w:rPr>
@@ -25291,7 +25162,7 @@
           </w:tcPr>
           <w:p>
             <w:pPr>
-              <w:pStyle w:val="10"/>
+              <w:pStyle w:val="12"/>
               <w:spacing w:before="11"/>
               <w:ind w:left="0"/>
               <w:rPr>
@@ -25301,7 +25172,7 @@
           </w:p>
           <w:p>
             <w:pPr>
-              <w:pStyle w:val="10"/>
+              <w:pStyle w:val="12"/>
               <w:ind w:left="106"/>
               <w:rPr>
                 <w:sz w:val="18"/>
@@ -25350,7 +25221,7 @@
           </w:tcPr>
           <w:p>
             <w:pPr>
-              <w:pStyle w:val="10"/>
+              <w:pStyle w:val="12"/>
               <w:spacing w:before="11"/>
               <w:ind w:left="0"/>
               <w:rPr>
@@ -25360,7 +25231,7 @@
           </w:p>
           <w:p>
             <w:pPr>
-              <w:pStyle w:val="10"/>
+              <w:pStyle w:val="12"/>
               <w:rPr>
                 <w:sz w:val="18"/>
               </w:rPr>
@@ -25380,7 +25251,7 @@
           </w:tcPr>
           <w:p>
             <w:pPr>
-              <w:pStyle w:val="10"/>
+              <w:pStyle w:val="12"/>
               <w:spacing w:before="11"/>
               <w:ind w:left="0"/>
               <w:rPr>
@@ -25390,7 +25261,7 @@
           </w:p>
           <w:p>
             <w:pPr>
-              <w:pStyle w:val="10"/>
+              <w:pStyle w:val="12"/>
               <w:ind w:left="108"/>
               <w:rPr>
                 <w:rFonts w:hint="default"/>
@@ -25422,7 +25293,7 @@
           </w:tcPr>
           <w:p>
             <w:pPr>
-              <w:pStyle w:val="10"/>
+              <w:pStyle w:val="12"/>
               <w:spacing w:before="1"/>
               <w:ind w:left="109"/>
               <w:rPr>
@@ -25474,7 +25345,7 @@
           </w:p>
           <w:p>
             <w:pPr>
-              <w:pStyle w:val="10"/>
+              <w:pStyle w:val="12"/>
               <w:spacing w:line="220" w:lineRule="atLeast"/>
               <w:ind w:left="109"/>
               <w:rPr>
@@ -25529,7 +25400,7 @@
           </w:tcPr>
           <w:p>
             <w:pPr>
-              <w:pStyle w:val="10"/>
+              <w:pStyle w:val="12"/>
               <w:spacing w:before="11"/>
               <w:ind w:left="0"/>
               <w:rPr>
@@ -25539,7 +25410,7 @@
           </w:p>
           <w:p>
             <w:pPr>
-              <w:pStyle w:val="10"/>
+              <w:pStyle w:val="12"/>
               <w:rPr>
                 <w:sz w:val="18"/>
               </w:rPr>
@@ -25559,7 +25430,7 @@
           </w:tcPr>
           <w:p>
             <w:pPr>
-              <w:pStyle w:val="10"/>
+              <w:pStyle w:val="12"/>
               <w:spacing w:before="110" w:line="252" w:lineRule="auto"/>
               <w:ind w:left="106"/>
               <w:rPr>
@@ -25602,7 +25473,7 @@
           </w:tcPr>
           <w:p>
             <w:pPr>
-              <w:pStyle w:val="10"/>
+              <w:pStyle w:val="12"/>
               <w:spacing w:before="11"/>
               <w:ind w:left="0"/>
               <w:rPr>
@@ -25612,7 +25483,7 @@
           </w:p>
           <w:p>
             <w:pPr>
-              <w:pStyle w:val="10"/>
+              <w:pStyle w:val="12"/>
               <w:rPr>
                 <w:sz w:val="18"/>
               </w:rPr>
@@ -25632,7 +25503,7 @@
           </w:tcPr>
           <w:p>
             <w:pPr>
-              <w:pStyle w:val="10"/>
+              <w:pStyle w:val="12"/>
               <w:spacing w:before="11"/>
               <w:ind w:left="0"/>
               <w:rPr>
@@ -25642,7 +25513,7 @@
           </w:p>
           <w:p>
             <w:pPr>
-              <w:pStyle w:val="10"/>
+              <w:pStyle w:val="12"/>
               <w:ind w:left="108"/>
               <w:rPr>
                 <w:sz w:val="18"/>
@@ -25663,7 +25534,7 @@
           </w:tcPr>
           <w:p>
             <w:pPr>
-              <w:pStyle w:val="10"/>
+              <w:pStyle w:val="12"/>
               <w:ind w:left="109"/>
               <w:rPr>
                 <w:sz w:val="18"/>
@@ -25721,7 +25592,7 @@
           </w:p>
           <w:p>
             <w:pPr>
-              <w:pStyle w:val="10"/>
+              <w:pStyle w:val="12"/>
               <w:spacing w:line="220" w:lineRule="atLeast"/>
               <w:ind w:left="109"/>
               <w:rPr>
@@ -25889,7 +25760,7 @@
           </w:tcPr>
           <w:p>
             <w:pPr>
-              <w:pStyle w:val="10"/>
+              <w:pStyle w:val="12"/>
               <w:spacing w:line="224" w:lineRule="exact"/>
               <w:ind w:left="746"/>
               <w:rPr>
@@ -25915,7 +25786,7 @@
           </w:tcPr>
           <w:p>
             <w:pPr>
-              <w:pStyle w:val="10"/>
+              <w:pStyle w:val="12"/>
               <w:spacing w:line="224" w:lineRule="exact"/>
               <w:ind w:left="508"/>
               <w:rPr>
@@ -25975,7 +25846,7 @@
           </w:tcPr>
           <w:p>
             <w:pPr>
-              <w:pStyle w:val="10"/>
+              <w:pStyle w:val="12"/>
               <w:spacing w:line="224" w:lineRule="exact"/>
               <w:ind w:left="509"/>
               <w:rPr>
@@ -26035,7 +25906,7 @@
           </w:tcPr>
           <w:p>
             <w:pPr>
-              <w:pStyle w:val="10"/>
+              <w:pStyle w:val="12"/>
               <w:spacing w:line="224" w:lineRule="exact"/>
               <w:ind w:left="449"/>
               <w:rPr>
@@ -26083,7 +25954,7 @@
           </w:tcPr>
           <w:p>
             <w:pPr>
-              <w:pStyle w:val="10"/>
+              <w:pStyle w:val="12"/>
               <w:spacing w:line="200" w:lineRule="exact"/>
               <w:rPr>
                 <w:sz w:val="18"/>
@@ -26117,7 +25988,7 @@
           </w:tcPr>
           <w:p>
             <w:pPr>
-              <w:pStyle w:val="10"/>
+              <w:pStyle w:val="12"/>
               <w:spacing w:line="200" w:lineRule="exact"/>
               <w:ind w:left="108"/>
               <w:rPr>
@@ -26152,7 +26023,7 @@
           </w:tcPr>
           <w:p>
             <w:pPr>
-              <w:pStyle w:val="10"/>
+              <w:pStyle w:val="12"/>
               <w:spacing w:line="200" w:lineRule="exact"/>
               <w:ind w:left="108"/>
               <w:rPr>
@@ -26188,7 +26059,7 @@
           </w:tcPr>
           <w:p>
             <w:pPr>
-              <w:pStyle w:val="10"/>
+              <w:pStyle w:val="12"/>
               <w:spacing w:line="200" w:lineRule="exact"/>
               <w:rPr>
                 <w:sz w:val="18"/>
@@ -26270,7 +26141,7 @@
           </w:tcPr>
           <w:p>
             <w:pPr>
-              <w:pStyle w:val="10"/>
+              <w:pStyle w:val="12"/>
               <w:spacing w:before="109"/>
               <w:rPr>
                 <w:sz w:val="18"/>
@@ -26297,7 +26168,7 @@
           </w:tcPr>
           <w:p>
             <w:pPr>
-              <w:pStyle w:val="10"/>
+              <w:pStyle w:val="12"/>
               <w:spacing w:before="109"/>
               <w:ind w:left="108"/>
               <w:rPr>
@@ -26319,7 +26190,7 @@
           </w:tcPr>
           <w:p>
             <w:pPr>
-              <w:pStyle w:val="10"/>
+              <w:pStyle w:val="12"/>
               <w:spacing w:before="109"/>
               <w:ind w:left="108"/>
               <w:rPr>
@@ -26341,7 +26212,7 @@
           </w:tcPr>
           <w:p>
             <w:pPr>
-              <w:pStyle w:val="10"/>
+              <w:pStyle w:val="12"/>
               <w:rPr>
                 <w:sz w:val="18"/>
               </w:rPr>
@@ -26362,7 +26233,7 @@
           </w:p>
           <w:p>
             <w:pPr>
-              <w:pStyle w:val="10"/>
+              <w:pStyle w:val="12"/>
               <w:spacing w:before="10" w:line="199" w:lineRule="exact"/>
               <w:rPr>
                 <w:sz w:val="18"/>
@@ -26388,7 +26259,7 @@
           </w:tcPr>
           <w:p>
             <w:pPr>
-              <w:pStyle w:val="10"/>
+              <w:pStyle w:val="12"/>
               <w:spacing w:before="110"/>
               <w:rPr>
                 <w:sz w:val="18"/>
@@ -26423,7 +26294,7 @@
           </w:tcPr>
           <w:p>
             <w:pPr>
-              <w:pStyle w:val="10"/>
+              <w:pStyle w:val="12"/>
               <w:spacing w:before="110"/>
               <w:ind w:left="108"/>
               <w:rPr>
@@ -26473,7 +26344,7 @@
           </w:tcPr>
           <w:p>
             <w:pPr>
-              <w:pStyle w:val="10"/>
+              <w:pStyle w:val="12"/>
               <w:spacing w:before="110"/>
               <w:ind w:left="108"/>
               <w:rPr>
@@ -26523,7 +26394,7 @@
           </w:tcPr>
           <w:p>
             <w:pPr>
-              <w:pStyle w:val="10"/>
+              <w:pStyle w:val="12"/>
               <w:rPr>
                 <w:sz w:val="18"/>
               </w:rPr>
@@ -26566,7 +26437,7 @@
           </w:p>
           <w:p>
             <w:pPr>
-              <w:pStyle w:val="10"/>
+              <w:pStyle w:val="12"/>
               <w:spacing w:before="11" w:line="199" w:lineRule="exact"/>
               <w:rPr>
                 <w:sz w:val="18"/>
@@ -26592,7 +26463,7 @@
           </w:tcPr>
           <w:p>
             <w:pPr>
-              <w:pStyle w:val="10"/>
+              <w:pStyle w:val="12"/>
               <w:spacing w:before="110"/>
               <w:rPr>
                 <w:sz w:val="18"/>
@@ -26628,7 +26499,7 @@
           </w:tcPr>
           <w:p>
             <w:pPr>
-              <w:pStyle w:val="10"/>
+              <w:pStyle w:val="12"/>
               <w:spacing w:before="110"/>
               <w:ind w:left="108"/>
               <w:rPr>
@@ -26692,7 +26563,7 @@
           </w:tcPr>
           <w:p>
             <w:pPr>
-              <w:pStyle w:val="10"/>
+              <w:pStyle w:val="12"/>
               <w:spacing w:before="110"/>
               <w:ind w:left="108"/>
               <w:rPr>
@@ -26743,7 +26614,7 @@
           </w:tcPr>
           <w:p>
             <w:pPr>
-              <w:pStyle w:val="10"/>
+              <w:pStyle w:val="12"/>
               <w:rPr>
                 <w:sz w:val="18"/>
               </w:rPr>
@@ -26814,7 +26685,7 @@
           </w:p>
           <w:p>
             <w:pPr>
-              <w:pStyle w:val="10"/>
+              <w:pStyle w:val="12"/>
               <w:spacing w:before="10" w:line="199" w:lineRule="exact"/>
               <w:rPr>
                 <w:sz w:val="18"/>
@@ -26840,7 +26711,7 @@
           </w:tcPr>
           <w:p>
             <w:pPr>
-              <w:pStyle w:val="10"/>
+              <w:pStyle w:val="12"/>
               <w:spacing w:before="1" w:line="199" w:lineRule="exact"/>
               <w:rPr>
                 <w:sz w:val="18"/>
@@ -26875,7 +26746,7 @@
           </w:tcPr>
           <w:p>
             <w:pPr>
-              <w:pStyle w:val="10"/>
+              <w:pStyle w:val="12"/>
               <w:spacing w:before="1" w:line="199" w:lineRule="exact"/>
               <w:ind w:left="108"/>
               <w:rPr>
@@ -26897,7 +26768,7 @@
           </w:tcPr>
           <w:p>
             <w:pPr>
-              <w:pStyle w:val="10"/>
+              <w:pStyle w:val="12"/>
               <w:spacing w:before="1" w:line="199" w:lineRule="exact"/>
               <w:ind w:left="108"/>
               <w:rPr>
@@ -26919,7 +26790,7 @@
           </w:tcPr>
           <w:p>
             <w:pPr>
-              <w:pStyle w:val="10"/>
+              <w:pStyle w:val="12"/>
               <w:spacing w:before="1" w:line="199" w:lineRule="exact"/>
               <w:rPr>
                 <w:sz w:val="18"/>
@@ -26997,7 +26868,7 @@
           </w:tcPr>
           <w:p>
             <w:pPr>
-              <w:pStyle w:val="10"/>
+              <w:pStyle w:val="12"/>
               <w:spacing w:before="110"/>
               <w:rPr>
                 <w:sz w:val="18"/>
@@ -27046,7 +26917,7 @@
           </w:tcPr>
           <w:p>
             <w:pPr>
-              <w:pStyle w:val="10"/>
+              <w:pStyle w:val="12"/>
               <w:spacing w:before="110"/>
               <w:ind w:left="108"/>
               <w:rPr>
@@ -27068,7 +26939,7 @@
           </w:tcPr>
           <w:p>
             <w:pPr>
-              <w:pStyle w:val="10"/>
+              <w:pStyle w:val="12"/>
               <w:spacing w:before="110"/>
               <w:ind w:left="108"/>
               <w:rPr>
@@ -27090,7 +26961,7 @@
           </w:tcPr>
           <w:p>
             <w:pPr>
-              <w:pStyle w:val="10"/>
+              <w:pStyle w:val="12"/>
               <w:rPr>
                 <w:sz w:val="18"/>
               </w:rPr>
@@ -27157,7 +27028,7 @@
           </w:p>
           <w:p>
             <w:pPr>
-              <w:pStyle w:val="10"/>
+              <w:pStyle w:val="12"/>
               <w:spacing w:before="10" w:line="200" w:lineRule="exact"/>
               <w:rPr>
                 <w:sz w:val="18"/>
@@ -27359,7 +27230,7 @@
     </w:p>
     <w:p>
       <w:pPr>
-        <w:pStyle w:val="9"/>
+        <w:pStyle w:val="11"/>
         <w:numPr>
           <w:ilvl w:val="0"/>
           <w:numId w:val="3"/>
@@ -27445,7 +27316,7 @@
     </w:p>
     <w:p>
       <w:pPr>
-        <w:pStyle w:val="9"/>
+        <w:pStyle w:val="11"/>
         <w:numPr>
           <w:ilvl w:val="0"/>
           <w:numId w:val="3"/>
@@ -27557,7 +27428,7 @@
     </w:p>
     <w:p>
       <w:pPr>
-        <w:pStyle w:val="9"/>
+        <w:pStyle w:val="11"/>
         <w:numPr>
           <w:ilvl w:val="0"/>
           <w:numId w:val="3"/>
@@ -27669,7 +27540,7 @@
     </w:p>
     <w:p>
       <w:pPr>
-        <w:pStyle w:val="9"/>
+        <w:pStyle w:val="11"/>
         <w:numPr>
           <w:ilvl w:val="0"/>
           <w:numId w:val="3"/>
@@ -27781,7 +27652,7 @@
     </w:p>
     <w:p>
       <w:pPr>
-        <w:pStyle w:val="9"/>
+        <w:pStyle w:val="11"/>
         <w:numPr>
           <w:ilvl w:val="0"/>
           <w:numId w:val="3"/>
@@ -27866,7 +27737,7 @@
     </w:p>
     <w:p>
       <w:pPr>
-        <w:pStyle w:val="9"/>
+        <w:pStyle w:val="11"/>
         <w:numPr>
           <w:ilvl w:val="0"/>
           <w:numId w:val="3"/>
@@ -27928,8 +27799,278 @@
         </w:rPr>
         <w:t>8</w:t>
       </w:r>
+    </w:p>
+    <w:p>
+      <w:pPr>
+        <w:pStyle w:val="11"/>
+        <w:widowControl w:val="0"/>
+        <w:numPr>
+          <w:numId w:val="0"/>
+        </w:numPr>
+        <w:tabs>
+          <w:tab w:val="left" w:pos="639"/>
+        </w:tabs>
+        <w:autoSpaceDE w:val="0"/>
+        <w:autoSpaceDN w:val="0"/>
+        <w:rPr>
+          <w:rFonts w:hint="default"/>
+          <w:spacing w:val="-4"/>
+          <w:sz w:val="19"/>
+          <w:lang w:val="en-US"/>
+        </w:rPr>
+      </w:pPr>
+    </w:p>
+    <w:p>
+      <w:pPr>
+        <w:pStyle w:val="2"/>
+        <w:ind w:left="72" w:firstLine="0"/>
+        <w:rPr>
+          <w:rFonts w:hint="default"/>
+          <w:spacing w:val="-4"/>
+          <w:sz w:val="19"/>
+          <w:lang w:val="en-US"/>
+        </w:rPr>
+      </w:pPr>
+      <w:r>
+        <w:rPr>
+          <w:color w:val="213353"/>
+        </w:rPr>
+        <w:t>Appendix</w:t>
+      </w:r>
+      <w:r>
+        <w:rPr>
+          <w:color w:val="213353"/>
+          <w:spacing w:val="-3"/>
+        </w:rPr>
+        <w:t xml:space="preserve"> </w:t>
+      </w:r>
+      <w:r>
+        <w:rPr>
+          <w:rFonts w:hint="default"/>
+          <w:color w:val="213353"/>
+          <w:spacing w:val="-3"/>
+          <w:lang w:val="en-US"/>
+        </w:rPr>
+        <w:t>B</w:t>
+      </w:r>
+      <w:r>
+        <w:rPr>
+          <w:color w:val="213353"/>
+        </w:rPr>
+        <w:t>.</w:t>
+      </w:r>
+      <w:r>
+        <w:rPr>
+          <w:color w:val="213353"/>
+          <w:spacing w:val="-2"/>
+        </w:rPr>
+        <w:t xml:space="preserve"> </w:t>
+      </w:r>
+      <w:r>
+        <w:rPr>
+          <w:rFonts w:hint="default"/>
+          <w:color w:val="213353"/>
+          <w:spacing w:val="-2"/>
+          <w:lang w:val="en-US"/>
+        </w:rPr>
+        <w:t xml:space="preserve"> Source Code Access</w:t>
+      </w:r>
+    </w:p>
+    <w:p>
+      <w:pPr>
+        <w:pStyle w:val="11"/>
+        <w:widowControl w:val="0"/>
+        <w:numPr>
+          <w:numId w:val="0"/>
+        </w:numPr>
+        <w:tabs>
+          <w:tab w:val="left" w:pos="639"/>
+        </w:tabs>
+        <w:autoSpaceDE w:val="0"/>
+        <w:autoSpaceDN w:val="0"/>
+        <w:rPr>
+          <w:rFonts w:hint="default"/>
+          <w:spacing w:val="-4"/>
+          <w:sz w:val="19"/>
+          <w:lang w:val="en-US"/>
+        </w:rPr>
+      </w:pPr>
+      <w:r>
+        <w:rPr>
+          <w:rFonts w:hint="default"/>
+          <w:spacing w:val="-4"/>
+          <w:sz w:val="19"/>
+          <w:lang w:val="en-US"/>
+        </w:rPr>
+        <w:t>The complete implementation of the email classifier, structured according to the principles of Separation of Concerns, Encapsulation, and Abstraction discussed in this report, is available online.</w:t>
+      </w:r>
+    </w:p>
+    <w:p>
+      <w:pPr>
+        <w:pStyle w:val="11"/>
+        <w:widowControl w:val="0"/>
+        <w:numPr>
+          <w:numId w:val="0"/>
+        </w:numPr>
+        <w:tabs>
+          <w:tab w:val="left" w:pos="639"/>
+        </w:tabs>
+        <w:autoSpaceDE w:val="0"/>
+        <w:autoSpaceDN w:val="0"/>
+        <w:rPr>
+          <w:rFonts w:hint="default"/>
+          <w:spacing w:val="-4"/>
+          <w:sz w:val="19"/>
+          <w:lang w:val="en-US"/>
+        </w:rPr>
+      </w:pPr>
+    </w:p>
+    <w:p>
+      <w:pPr>
+        <w:pStyle w:val="11"/>
+        <w:widowControl w:val="0"/>
+        <w:numPr>
+          <w:numId w:val="0"/>
+        </w:numPr>
+        <w:tabs>
+          <w:tab w:val="left" w:pos="639"/>
+        </w:tabs>
+        <w:autoSpaceDE w:val="0"/>
+        <w:autoSpaceDN w:val="0"/>
+        <w:rPr>
+          <w:rFonts w:hint="default"/>
+          <w:spacing w:val="-4"/>
+          <w:sz w:val="19"/>
+          <w:lang w:val="en-US"/>
+        </w:rPr>
+      </w:pPr>
+      <w:r>
+        <w:rPr>
+          <w:rFonts w:hint="default"/>
+          <w:b/>
+          <w:bCs/>
+          <w:spacing w:val="-4"/>
+          <w:sz w:val="19"/>
+          <w:lang w:val="en-US"/>
+        </w:rPr>
+        <w:t>Link:</w:t>
+      </w:r>
+      <w:r>
+        <w:rPr>
+          <w:rFonts w:hint="default"/>
+          <w:spacing w:val="-4"/>
+          <w:sz w:val="19"/>
+          <w:lang w:val="en-US"/>
+        </w:rPr>
+        <w:t xml:space="preserve"> </w:t>
+      </w:r>
+    </w:p>
+    <w:p>
+      <w:pPr>
+        <w:pStyle w:val="11"/>
+        <w:widowControl w:val="0"/>
+        <w:numPr>
+          <w:numId w:val="0"/>
+        </w:numPr>
+        <w:tabs>
+          <w:tab w:val="left" w:pos="639"/>
+        </w:tabs>
+        <w:autoSpaceDE w:val="0"/>
+        <w:autoSpaceDN w:val="0"/>
+        <w:rPr>
+          <w:rFonts w:hint="default"/>
+          <w:spacing w:val="-4"/>
+          <w:sz w:val="19"/>
+          <w:lang w:val="en-US"/>
+        </w:rPr>
+      </w:pPr>
+      <w:r>
+        <w:rPr>
+          <w:rFonts w:hint="default"/>
+          <w:spacing w:val="-4"/>
+          <w:sz w:val="19"/>
+          <w:lang w:val="en-US"/>
+        </w:rPr>
+        <w:fldChar w:fldCharType="begin"/>
+      </w:r>
+      <w:r>
+        <w:rPr>
+          <w:rFonts w:hint="default"/>
+          <w:spacing w:val="-4"/>
+          <w:sz w:val="19"/>
+          <w:lang w:val="en-US"/>
+        </w:rPr>
+        <w:instrText xml:space="preserve"> HYPERLINK "https://github.com/hasnat360/EEA_MultiLabel_Email_Classifier" </w:instrText>
+      </w:r>
+      <w:r>
+        <w:rPr>
+          <w:rFonts w:hint="default"/>
+          <w:spacing w:val="-4"/>
+          <w:sz w:val="19"/>
+          <w:lang w:val="en-US"/>
+        </w:rPr>
+        <w:fldChar w:fldCharType="separate"/>
+      </w:r>
+      <w:r>
+        <w:rPr>
+          <w:rStyle w:val="6"/>
+          <w:rFonts w:hint="default"/>
+          <w:spacing w:val="-4"/>
+          <w:sz w:val="19"/>
+          <w:lang w:val="en-US"/>
+        </w:rPr>
+        <w:t>https://github.com/hasnat360/EEA_MultiLa</w:t>
+      </w:r>
       <w:bookmarkStart w:id="10" w:name="_GoBack"/>
       <w:bookmarkEnd w:id="10"/>
+      <w:r>
+        <w:rPr>
+          <w:rStyle w:val="6"/>
+          <w:rFonts w:hint="default"/>
+          <w:spacing w:val="-4"/>
+          <w:sz w:val="19"/>
+          <w:lang w:val="en-US"/>
+        </w:rPr>
+        <w:t>bel_Email_Classifier</w:t>
+      </w:r>
+      <w:r>
+        <w:rPr>
+          <w:rFonts w:hint="default"/>
+          <w:spacing w:val="-4"/>
+          <w:sz w:val="19"/>
+          <w:lang w:val="en-US"/>
+        </w:rPr>
+        <w:fldChar w:fldCharType="end"/>
+      </w:r>
+      <w:r>
+        <w:rPr>
+          <w:rFonts w:hint="default"/>
+          <w:spacing w:val="-4"/>
+          <w:sz w:val="19"/>
+          <w:lang w:val="en-US"/>
+        </w:rPr>
+        <w:t xml:space="preserve"> - https://github.com/hasnat360/EEA_MultiLabel_Email_Classifier</w:t>
+      </w:r>
+    </w:p>
+    <w:p>
+      <w:pPr>
+        <w:pStyle w:val="11"/>
+        <w:widowControl w:val="0"/>
+        <w:numPr>
+          <w:numId w:val="0"/>
+        </w:numPr>
+        <w:tabs>
+          <w:tab w:val="left" w:pos="639"/>
+        </w:tabs>
+        <w:autoSpaceDE w:val="0"/>
+        <w:autoSpaceDN w:val="0"/>
+        <w:rPr>
+          <w:rFonts w:hint="default"/>
+          <w:spacing w:val="-4"/>
+          <w:sz w:val="19"/>
+          <w:lang w:val="en-US"/>
+        </w:rPr>
+      </w:pPr>
     </w:p>
     <w:sectPr>
       <w:pgSz w:w="12240" w:h="15840"/>
@@ -28006,7 +28147,7 @@
                       <w:txbxContent>
                         <w:p>
                           <w:pPr>
-                            <w:pStyle w:val="6"/>
+                            <w:pStyle w:val="7"/>
                           </w:pPr>
                           <w:r>
                             <w:fldChar w:fldCharType="begin"/>
@@ -28046,7 +28187,7 @@
                 <w:txbxContent>
                   <w:p>
                     <w:pPr>
-                      <w:pStyle w:val="6"/>
+                      <w:pStyle w:val="7"/>
                     </w:pPr>
                     <w:r>
                       <w:fldChar w:fldCharType="begin"/>
@@ -28157,7 +28298,7 @@
 <w:hdr xmlns:wpc="http://schemas.microsoft.com/office/word/2010/wordprocessingCanvas" xmlns:mc="http://schemas.openxmlformats.org/markup-compatibility/2006" xmlns:o="urn:schemas-microsoft-com:office:office" xmlns:r="http://schemas.openxmlformats.org/officeDocument/2006/relationships" xmlns:m="http://schemas.openxmlformats.org/officeDocument/2006/math" xmlns:v="urn:schemas-microsoft-com:vml" xmlns:wp14="http://schemas.microsoft.com/office/word/2010/wordprocessingDrawing" xmlns:wp="http://schemas.openxmlformats.org/drawingml/2006/wordprocessingDrawing" xmlns:w10="urn:schemas-microsoft-com:office:word" xmlns:w="http://schemas.openxmlformats.org/wordprocessingml/2006/main" xmlns:w14="http://schemas.microsoft.com/office/word/2010/wordml" xmlns:w15="http://schemas.microsoft.com/office/word/2012/wordml" xmlns:wpg="http://schemas.microsoft.com/office/word/2010/wordprocessingGroup" xmlns:wpi="http://schemas.microsoft.com/office/word/2010/wordprocessingInk" xmlns:wne="http://schemas.microsoft.com/office/word/2006/wordml" xmlns:wps="http://schemas.microsoft.com/office/word/2010/wordprocessingShape" xmlns:wpsCustomData="http://www.wps.cn/officeDocument/2013/wpsCustomData" mc:Ignorable="w14 w15 wp14">
   <w:p>
     <w:pPr>
-      <w:pStyle w:val="7"/>
+      <w:pStyle w:val="8"/>
       <w:pBdr>
         <w:bottom w:val="none" w:color="auto" w:sz="0" w:space="0"/>
       </w:pBdr>
@@ -28896,7 +29037,18 @@
       <w:szCs w:val="21"/>
     </w:rPr>
   </w:style>
-  <w:style w:type="paragraph" w:styleId="6">
+  <w:style w:type="character" w:styleId="6">
+    <w:name w:val="FollowedHyperlink"/>
+    <w:basedOn w:val="3"/>
+    <w:semiHidden/>
+    <w:unhideWhenUsed/>
+    <w:uiPriority w:val="99"/>
+    <w:rPr>
+      <w:color w:val="800080"/>
+      <w:u w:val="single"/>
+    </w:rPr>
+  </w:style>
+  <w:style w:type="paragraph" w:styleId="7">
     <w:name w:val="footer"/>
     <w:basedOn w:val="1"/>
     <w:semiHidden/>
@@ -28915,7 +29067,7 @@
       <w:szCs w:val="18"/>
     </w:rPr>
   </w:style>
-  <w:style w:type="paragraph" w:styleId="7">
+  <w:style w:type="paragraph" w:styleId="8">
     <w:name w:val="header"/>
     <w:basedOn w:val="1"/>
     <w:semiHidden/>
@@ -28933,7 +29085,18 @@
       <w:szCs w:val="18"/>
     </w:rPr>
   </w:style>
-  <w:style w:type="paragraph" w:styleId="8">
+  <w:style w:type="character" w:styleId="9">
+    <w:name w:val="Hyperlink"/>
+    <w:basedOn w:val="3"/>
+    <w:semiHidden/>
+    <w:unhideWhenUsed/>
+    <w:uiPriority w:val="99"/>
+    <w:rPr>
+      <w:color w:val="0000FF"/>
+      <w:u w:val="single"/>
+    </w:rPr>
+  </w:style>
+  <w:style w:type="paragraph" w:styleId="10">
     <w:name w:val="Title"/>
     <w:basedOn w:val="1"/>
     <w:qFormat/>
@@ -28950,7 +29113,7 @@
       <w:szCs w:val="44"/>
     </w:rPr>
   </w:style>
-  <w:style w:type="paragraph" w:styleId="9">
+  <w:style w:type="paragraph" w:styleId="11">
     <w:name w:val="List Paragraph"/>
     <w:basedOn w:val="1"/>
     <w:qFormat/>
@@ -28962,7 +29125,7 @@
       <w:rFonts w:ascii="Consolas" w:hAnsi="Consolas" w:eastAsia="Consolas" w:cs="Consolas"/>
     </w:rPr>
   </w:style>
-  <w:style w:type="paragraph" w:customStyle="1" w:styleId="10">
+  <w:style w:type="paragraph" w:customStyle="1" w:styleId="12">
     <w:name w:val="Table Paragraph"/>
     <w:basedOn w:val="1"/>
     <w:qFormat/>

</xml_diff>